<commit_message>
feat: add model-specific investor protection framework
</commit_message>
<xml_diff>
--- a/docs/60-40/source/en/Agri-Farmer-Fidlot-v5.9-6040-EN.docx
+++ b/docs/60-40/source/en/Agri-Farmer-Fidlot-v5.9-6040-EN.docx
@@ -63,7 +63,7 @@
           <w:color w:val="667085"/>
           <w:sz w:val="17"/>
         </w:rPr>
-        <w:t>v5.9 | 7 cycles x 5 months | 60/40 split | Fee 20% | EN</w:t>
+        <w:t>v5.9 | 7 cycles x 5 months | 60/40 split | Reserve 44% | Fee 20% | EN</w:t>
       </w:r>
     </w:p>
     <w:tbl>
@@ -223,7 +223,7 @@
                 <w:color w:val="004D40"/>
                 <w:sz w:val="34"/>
               </w:rPr>
-              <w:t>$15,250</w:t>
+              <w:t>$7,330</w:t>
             </w:r>
           </w:p>
         </w:tc>
@@ -1229,7 +1229,7 @@
                 <w:color w:val="FFFFFF"/>
                 <w:sz w:val="17"/>
               </w:rPr>
-              <w:t>Farmer take-home</w:t>
+              <w:t>Farmer cash before reserve</w:t>
             </w:r>
           </w:p>
         </w:tc>
@@ -2429,7 +2429,7 @@
                 <w:color w:val="FFFFFF"/>
                 <w:sz w:val="14"/>
               </w:rPr>
-              <w:t>FARMER TAKE-HOME</w:t>
+              <w:t>Farmer cash before reserve</w:t>
             </w:r>
           </w:p>
         </w:tc>
@@ -2458,7 +2458,7 @@
                 <w:color w:val="FFFFFF"/>
                 <w:sz w:val="14"/>
               </w:rPr>
-              <w:t>Cash</w:t>
+              <w:t>Before reserve</w:t>
             </w:r>
           </w:p>
         </w:tc>
@@ -3281,7 +3281,7 @@
                 <w:color w:val="FFFFFF"/>
                 <w:sz w:val="14"/>
               </w:rPr>
-              <w:t>FARMER TAKE-HOME</w:t>
+              <w:t>Farmer cash before reserve</w:t>
             </w:r>
           </w:p>
         </w:tc>
@@ -3310,7 +3310,7 @@
                 <w:color w:val="FFFFFF"/>
                 <w:sz w:val="14"/>
               </w:rPr>
-              <w:t>Cash</w:t>
+              <w:t>Before reserve</w:t>
             </w:r>
           </w:p>
         </w:tc>
@@ -4222,7 +4222,7 @@
                 <w:color w:val="FFFFFF"/>
                 <w:sz w:val="14"/>
               </w:rPr>
-              <w:t>FARMER TAKE-HOME</w:t>
+              <w:t>Farmer cash before reserve</w:t>
             </w:r>
           </w:p>
         </w:tc>
@@ -4251,7 +4251,7 @@
                 <w:color w:val="FFFFFF"/>
                 <w:sz w:val="14"/>
               </w:rPr>
-              <w:t>Cash</w:t>
+              <w:t>Before reserve</w:t>
             </w:r>
           </w:p>
         </w:tc>
@@ -5223,7 +5223,7 @@
                 <w:color w:val="FFFFFF"/>
                 <w:sz w:val="14"/>
               </w:rPr>
-              <w:t>FARMER TAKE-HOME</w:t>
+              <w:t>Farmer cash before reserve</w:t>
             </w:r>
           </w:p>
         </w:tc>
@@ -5252,7 +5252,7 @@
                 <w:color w:val="FFFFFF"/>
                 <w:sz w:val="14"/>
               </w:rPr>
-              <w:t>Cash</w:t>
+              <w:t>Before reserve</w:t>
             </w:r>
           </w:p>
         </w:tc>
@@ -6164,7 +6164,7 @@
                 <w:color w:val="FFFFFF"/>
                 <w:sz w:val="14"/>
               </w:rPr>
-              <w:t>FARMER TAKE-HOME</w:t>
+              <w:t>Farmer cash before reserve</w:t>
             </w:r>
           </w:p>
         </w:tc>
@@ -6193,7 +6193,7 @@
                 <w:color w:val="FFFFFF"/>
                 <w:sz w:val="14"/>
               </w:rPr>
-              <w:t>Cash</w:t>
+              <w:t>Before reserve</w:t>
             </w:r>
           </w:p>
         </w:tc>
@@ -7165,7 +7165,7 @@
                 <w:color w:val="FFFFFF"/>
                 <w:sz w:val="14"/>
               </w:rPr>
-              <w:t>FARMER TAKE-HOME</w:t>
+              <w:t>Farmer cash before reserve</w:t>
             </w:r>
           </w:p>
         </w:tc>
@@ -7194,7 +7194,7 @@
                 <w:color w:val="FFFFFF"/>
                 <w:sz w:val="14"/>
               </w:rPr>
-              <w:t>Cash</w:t>
+              <w:t>Before reserve</w:t>
             </w:r>
           </w:p>
         </w:tc>
@@ -8106,7 +8106,7 @@
                 <w:color w:val="FFFFFF"/>
                 <w:sz w:val="14"/>
               </w:rPr>
-              <w:t>FARMER TAKE-HOME</w:t>
+              <w:t>Farmer cash before reserve</w:t>
             </w:r>
           </w:p>
         </w:tc>
@@ -8135,7 +8135,7 @@
                 <w:color w:val="FFFFFF"/>
                 <w:sz w:val="14"/>
               </w:rPr>
-              <w:t>Cash</w:t>
+              <w:t>Before reserve</w:t>
             </w:r>
           </w:p>
         </w:tc>
@@ -8173,966 +8173,6 @@
     <w:p>
       <w:pPr>
         <w:spacing w:before="0" w:after="40" w:line="240" w:lineRule="auto"/>
-      </w:pPr>
-    </w:p>
-    <w:p>
-      <w:pPr>
-        <w:pStyle w:val="Heading1"/>
-      </w:pPr>
-      <w:r>
-        <w:t>Cash-flow summary</w:t>
-      </w:r>
-    </w:p>
-    <w:tbl>
-      <w:tblPr>
-        <w:tblStyle w:val="TableGrid"/>
-        <w:tblW w:type="dxa" w:w="10656"/>
-        <w:jc w:val="center"/>
-        <w:tblLayout w:type="fixed"/>
-        <w:tblLook w:firstColumn="1" w:firstRow="1" w:lastColumn="0" w:lastRow="0" w:noHBand="0" w:noVBand="1" w:val="04A0"/>
-        <w:tblInd w:w="120" w:type="dxa"/>
-      </w:tblPr>
-      <w:tblGrid>
-        <w:gridCol w:w="1650"/>
-        <w:gridCol w:w="2600"/>
-        <w:gridCol w:w="2900"/>
-        <w:gridCol w:w="3506"/>
-      </w:tblGrid>
-      <w:tr>
-        <w:trPr>
-          <w:tblHeader w:val="true"/>
-        </w:trPr>
-        <w:tc>
-          <w:tcPr>
-            <w:tcW w:type="dxa" w:w="1650"/>
-            <w:shd w:fill="1769C2"/>
-            <w:vAlign w:val="center"/>
-            <w:tcMar>
-              <w:top w:w="100" w:type="dxa"/>
-              <w:start w:w="120" w:type="dxa"/>
-              <w:bottom w:w="100" w:type="dxa"/>
-              <w:end w:w="120" w:type="dxa"/>
-            </w:tcMar>
-          </w:tcPr>
-          <w:p>
-            <w:pPr>
-              <w:spacing w:before="0" w:after="0" w:line="252" w:lineRule="auto"/>
-              <w:jc w:val="center"/>
-            </w:pPr>
-            <w:r>
-              <w:rPr>
-                <w:rFonts w:ascii="Arial" w:hAnsi="Arial"/>
-                <w:b/>
-                <w:i w:val="0"/>
-                <w:color w:val="FFFFFF"/>
-                <w:sz w:val="17"/>
-              </w:rPr>
-              <w:t>Cycle</w:t>
-            </w:r>
-          </w:p>
-        </w:tc>
-        <w:tc>
-          <w:tcPr>
-            <w:tcW w:type="dxa" w:w="2600"/>
-            <w:shd w:fill="1769C2"/>
-            <w:vAlign w:val="center"/>
-            <w:tcMar>
-              <w:top w:w="100" w:type="dxa"/>
-              <w:start w:w="120" w:type="dxa"/>
-              <w:bottom w:w="100" w:type="dxa"/>
-              <w:end w:w="120" w:type="dxa"/>
-            </w:tcMar>
-          </w:tcPr>
-          <w:p>
-            <w:pPr>
-              <w:spacing w:before="0" w:after="0" w:line="252" w:lineRule="auto"/>
-              <w:jc w:val="center"/>
-            </w:pPr>
-            <w:r>
-              <w:rPr>
-                <w:rFonts w:ascii="Arial" w:hAnsi="Arial"/>
-                <w:b/>
-                <w:i w:val="0"/>
-                <w:color w:val="FFFFFF"/>
-                <w:sz w:val="17"/>
-              </w:rPr>
-              <w:t>Period</w:t>
-            </w:r>
-          </w:p>
-        </w:tc>
-        <w:tc>
-          <w:tcPr>
-            <w:tcW w:type="dxa" w:w="2900"/>
-            <w:shd w:fill="1769C2"/>
-            <w:vAlign w:val="center"/>
-            <w:tcMar>
-              <w:top w:w="100" w:type="dxa"/>
-              <w:start w:w="120" w:type="dxa"/>
-              <w:bottom w:w="100" w:type="dxa"/>
-              <w:end w:w="120" w:type="dxa"/>
-            </w:tcMar>
-          </w:tcPr>
-          <w:p>
-            <w:pPr>
-              <w:spacing w:before="0" w:after="0" w:line="252" w:lineRule="auto"/>
-              <w:jc w:val="center"/>
-            </w:pPr>
-            <w:r>
-              <w:rPr>
-                <w:rFonts w:ascii="Arial" w:hAnsi="Arial"/>
-                <w:b/>
-                <w:i w:val="0"/>
-                <w:color w:val="FFFFFF"/>
-                <w:sz w:val="17"/>
-              </w:rPr>
-              <w:t>Farmer take-home</w:t>
-            </w:r>
-          </w:p>
-        </w:tc>
-        <w:tc>
-          <w:tcPr>
-            <w:tcW w:type="dxa" w:w="3506"/>
-            <w:shd w:fill="1769C2"/>
-            <w:vAlign w:val="center"/>
-            <w:tcMar>
-              <w:top w:w="100" w:type="dxa"/>
-              <w:start w:w="120" w:type="dxa"/>
-              <w:bottom w:w="100" w:type="dxa"/>
-              <w:end w:w="120" w:type="dxa"/>
-            </w:tcMar>
-          </w:tcPr>
-          <w:p>
-            <w:pPr>
-              <w:spacing w:before="0" w:after="0" w:line="252" w:lineRule="auto"/>
-              <w:jc w:val="center"/>
-            </w:pPr>
-            <w:r>
-              <w:rPr>
-                <w:rFonts w:ascii="Arial" w:hAnsi="Arial"/>
-                <w:b/>
-                <w:i w:val="0"/>
-                <w:color w:val="FFFFFF"/>
-                <w:sz w:val="17"/>
-              </w:rPr>
-              <w:t>Cumulative</w:t>
-            </w:r>
-          </w:p>
-        </w:tc>
-      </w:tr>
-      <w:tr>
-        <w:tc>
-          <w:tcPr>
-            <w:tcW w:type="dxa" w:w="1650"/>
-            <w:vAlign w:val="center"/>
-            <w:tcMar>
-              <w:top w:w="100" w:type="dxa"/>
-              <w:start w:w="120" w:type="dxa"/>
-              <w:bottom w:w="100" w:type="dxa"/>
-              <w:end w:w="120" w:type="dxa"/>
-            </w:tcMar>
-          </w:tcPr>
-          <w:p>
-            <w:pPr>
-              <w:spacing w:before="0" w:after="0" w:line="264" w:lineRule="auto"/>
-              <w:jc w:val="left"/>
-            </w:pPr>
-            <w:r>
-              <w:rPr>
-                <w:rFonts w:ascii="Arial" w:hAnsi="Arial"/>
-                <w:b w:val="0"/>
-                <w:i w:val="0"/>
-                <w:color w:val="17212B"/>
-                <w:sz w:val="15"/>
-              </w:rPr>
-              <w:t>1</w:t>
-            </w:r>
-          </w:p>
-        </w:tc>
-        <w:tc>
-          <w:tcPr>
-            <w:tcW w:type="dxa" w:w="2600"/>
-            <w:vAlign w:val="center"/>
-            <w:tcMar>
-              <w:top w:w="100" w:type="dxa"/>
-              <w:start w:w="120" w:type="dxa"/>
-              <w:bottom w:w="100" w:type="dxa"/>
-              <w:end w:w="120" w:type="dxa"/>
-            </w:tcMar>
-          </w:tcPr>
-          <w:p>
-            <w:pPr>
-              <w:spacing w:before="0" w:after="0" w:line="264" w:lineRule="auto"/>
-              <w:jc w:val="center"/>
-            </w:pPr>
-            <w:r>
-              <w:rPr>
-                <w:rFonts w:ascii="Arial" w:hAnsi="Arial"/>
-                <w:b w:val="0"/>
-                <w:i w:val="0"/>
-                <w:color w:val="17212B"/>
-                <w:sz w:val="15"/>
-              </w:rPr>
-              <w:t>0-5 months</w:t>
-            </w:r>
-          </w:p>
-        </w:tc>
-        <w:tc>
-          <w:tcPr>
-            <w:tcW w:type="dxa" w:w="2900"/>
-            <w:vAlign w:val="center"/>
-            <w:tcMar>
-              <w:top w:w="100" w:type="dxa"/>
-              <w:start w:w="120" w:type="dxa"/>
-              <w:bottom w:w="100" w:type="dxa"/>
-              <w:end w:w="120" w:type="dxa"/>
-            </w:tcMar>
-          </w:tcPr>
-          <w:p>
-            <w:pPr>
-              <w:spacing w:before="0" w:after="0" w:line="264" w:lineRule="auto"/>
-              <w:jc w:val="center"/>
-            </w:pPr>
-            <w:r>
-              <w:rPr>
-                <w:rFonts w:ascii="Arial" w:hAnsi="Arial"/>
-                <w:b w:val="0"/>
-                <w:i w:val="0"/>
-                <w:color w:val="17212B"/>
-                <w:sz w:val="15"/>
-              </w:rPr>
-              <w:t>$15,250</w:t>
-            </w:r>
-          </w:p>
-        </w:tc>
-        <w:tc>
-          <w:tcPr>
-            <w:tcW w:type="dxa" w:w="3506"/>
-            <w:vAlign w:val="center"/>
-            <w:tcMar>
-              <w:top w:w="100" w:type="dxa"/>
-              <w:start w:w="120" w:type="dxa"/>
-              <w:bottom w:w="100" w:type="dxa"/>
-              <w:end w:w="120" w:type="dxa"/>
-            </w:tcMar>
-          </w:tcPr>
-          <w:p>
-            <w:pPr>
-              <w:spacing w:before="0" w:after="0" w:line="264" w:lineRule="auto"/>
-              <w:jc w:val="center"/>
-            </w:pPr>
-            <w:r>
-              <w:rPr>
-                <w:rFonts w:ascii="Arial" w:hAnsi="Arial"/>
-                <w:b w:val="0"/>
-                <w:i w:val="0"/>
-                <w:color w:val="17212B"/>
-                <w:sz w:val="15"/>
-              </w:rPr>
-              <w:t>$15,250</w:t>
-            </w:r>
-          </w:p>
-        </w:tc>
-      </w:tr>
-      <w:tr>
-        <w:tc>
-          <w:tcPr>
-            <w:tcW w:type="dxa" w:w="1650"/>
-            <w:shd w:fill="FAFBFC"/>
-            <w:vAlign w:val="center"/>
-            <w:tcMar>
-              <w:top w:w="100" w:type="dxa"/>
-              <w:start w:w="120" w:type="dxa"/>
-              <w:bottom w:w="100" w:type="dxa"/>
-              <w:end w:w="120" w:type="dxa"/>
-            </w:tcMar>
-          </w:tcPr>
-          <w:p>
-            <w:pPr>
-              <w:spacing w:before="0" w:after="0" w:line="264" w:lineRule="auto"/>
-              <w:jc w:val="left"/>
-            </w:pPr>
-            <w:r>
-              <w:rPr>
-                <w:rFonts w:ascii="Arial" w:hAnsi="Arial"/>
-                <w:b w:val="0"/>
-                <w:i w:val="0"/>
-                <w:color w:val="17212B"/>
-                <w:sz w:val="15"/>
-              </w:rPr>
-              <w:t>2</w:t>
-            </w:r>
-          </w:p>
-        </w:tc>
-        <w:tc>
-          <w:tcPr>
-            <w:tcW w:type="dxa" w:w="2600"/>
-            <w:shd w:fill="FAFBFC"/>
-            <w:vAlign w:val="center"/>
-            <w:tcMar>
-              <w:top w:w="100" w:type="dxa"/>
-              <w:start w:w="120" w:type="dxa"/>
-              <w:bottom w:w="100" w:type="dxa"/>
-              <w:end w:w="120" w:type="dxa"/>
-            </w:tcMar>
-          </w:tcPr>
-          <w:p>
-            <w:pPr>
-              <w:spacing w:before="0" w:after="0" w:line="264" w:lineRule="auto"/>
-              <w:jc w:val="center"/>
-            </w:pPr>
-            <w:r>
-              <w:rPr>
-                <w:rFonts w:ascii="Arial" w:hAnsi="Arial"/>
-                <w:b w:val="0"/>
-                <w:i w:val="0"/>
-                <w:color w:val="17212B"/>
-                <w:sz w:val="15"/>
-              </w:rPr>
-              <w:t>5-10 months</w:t>
-            </w:r>
-          </w:p>
-        </w:tc>
-        <w:tc>
-          <w:tcPr>
-            <w:tcW w:type="dxa" w:w="2900"/>
-            <w:shd w:fill="FAFBFC"/>
-            <w:vAlign w:val="center"/>
-            <w:tcMar>
-              <w:top w:w="100" w:type="dxa"/>
-              <w:start w:w="120" w:type="dxa"/>
-              <w:bottom w:w="100" w:type="dxa"/>
-              <w:end w:w="120" w:type="dxa"/>
-            </w:tcMar>
-          </w:tcPr>
-          <w:p>
-            <w:pPr>
-              <w:spacing w:before="0" w:after="0" w:line="264" w:lineRule="auto"/>
-              <w:jc w:val="center"/>
-            </w:pPr>
-            <w:r>
-              <w:rPr>
-                <w:rFonts w:ascii="Arial" w:hAnsi="Arial"/>
-                <w:b w:val="0"/>
-                <w:i w:val="0"/>
-                <w:color w:val="17212B"/>
-                <w:sz w:val="15"/>
-              </w:rPr>
-              <w:t>$15,250</w:t>
-            </w:r>
-          </w:p>
-        </w:tc>
-        <w:tc>
-          <w:tcPr>
-            <w:tcW w:type="dxa" w:w="3506"/>
-            <w:shd w:fill="FAFBFC"/>
-            <w:vAlign w:val="center"/>
-            <w:tcMar>
-              <w:top w:w="100" w:type="dxa"/>
-              <w:start w:w="120" w:type="dxa"/>
-              <w:bottom w:w="100" w:type="dxa"/>
-              <w:end w:w="120" w:type="dxa"/>
-            </w:tcMar>
-          </w:tcPr>
-          <w:p>
-            <w:pPr>
-              <w:spacing w:before="0" w:after="0" w:line="264" w:lineRule="auto"/>
-              <w:jc w:val="center"/>
-            </w:pPr>
-            <w:r>
-              <w:rPr>
-                <w:rFonts w:ascii="Arial" w:hAnsi="Arial"/>
-                <w:b w:val="0"/>
-                <w:i w:val="0"/>
-                <w:color w:val="17212B"/>
-                <w:sz w:val="15"/>
-              </w:rPr>
-              <w:t>$30,500</w:t>
-            </w:r>
-          </w:p>
-        </w:tc>
-      </w:tr>
-      <w:tr>
-        <w:tc>
-          <w:tcPr>
-            <w:tcW w:type="dxa" w:w="1650"/>
-            <w:vAlign w:val="center"/>
-            <w:tcMar>
-              <w:top w:w="100" w:type="dxa"/>
-              <w:start w:w="120" w:type="dxa"/>
-              <w:bottom w:w="100" w:type="dxa"/>
-              <w:end w:w="120" w:type="dxa"/>
-            </w:tcMar>
-          </w:tcPr>
-          <w:p>
-            <w:pPr>
-              <w:spacing w:before="0" w:after="0" w:line="264" w:lineRule="auto"/>
-              <w:jc w:val="left"/>
-            </w:pPr>
-            <w:r>
-              <w:rPr>
-                <w:rFonts w:ascii="Arial" w:hAnsi="Arial"/>
-                <w:b w:val="0"/>
-                <w:i w:val="0"/>
-                <w:color w:val="17212B"/>
-                <w:sz w:val="15"/>
-              </w:rPr>
-              <w:t>3</w:t>
-            </w:r>
-          </w:p>
-        </w:tc>
-        <w:tc>
-          <w:tcPr>
-            <w:tcW w:type="dxa" w:w="2600"/>
-            <w:vAlign w:val="center"/>
-            <w:tcMar>
-              <w:top w:w="100" w:type="dxa"/>
-              <w:start w:w="120" w:type="dxa"/>
-              <w:bottom w:w="100" w:type="dxa"/>
-              <w:end w:w="120" w:type="dxa"/>
-            </w:tcMar>
-          </w:tcPr>
-          <w:p>
-            <w:pPr>
-              <w:spacing w:before="0" w:after="0" w:line="264" w:lineRule="auto"/>
-              <w:jc w:val="center"/>
-            </w:pPr>
-            <w:r>
-              <w:rPr>
-                <w:rFonts w:ascii="Arial" w:hAnsi="Arial"/>
-                <w:b w:val="0"/>
-                <w:i w:val="0"/>
-                <w:color w:val="17212B"/>
-                <w:sz w:val="15"/>
-              </w:rPr>
-              <w:t>10-15 months</w:t>
-            </w:r>
-          </w:p>
-        </w:tc>
-        <w:tc>
-          <w:tcPr>
-            <w:tcW w:type="dxa" w:w="2900"/>
-            <w:vAlign w:val="center"/>
-            <w:tcMar>
-              <w:top w:w="100" w:type="dxa"/>
-              <w:start w:w="120" w:type="dxa"/>
-              <w:bottom w:w="100" w:type="dxa"/>
-              <w:end w:w="120" w:type="dxa"/>
-            </w:tcMar>
-          </w:tcPr>
-          <w:p>
-            <w:pPr>
-              <w:spacing w:before="0" w:after="0" w:line="264" w:lineRule="auto"/>
-              <w:jc w:val="center"/>
-            </w:pPr>
-            <w:r>
-              <w:rPr>
-                <w:rFonts w:ascii="Arial" w:hAnsi="Arial"/>
-                <w:b w:val="0"/>
-                <w:i w:val="0"/>
-                <w:color w:val="17212B"/>
-                <w:sz w:val="15"/>
-              </w:rPr>
-              <w:t>$13,150</w:t>
-            </w:r>
-          </w:p>
-        </w:tc>
-        <w:tc>
-          <w:tcPr>
-            <w:tcW w:type="dxa" w:w="3506"/>
-            <w:vAlign w:val="center"/>
-            <w:tcMar>
-              <w:top w:w="100" w:type="dxa"/>
-              <w:start w:w="120" w:type="dxa"/>
-              <w:bottom w:w="100" w:type="dxa"/>
-              <w:end w:w="120" w:type="dxa"/>
-            </w:tcMar>
-          </w:tcPr>
-          <w:p>
-            <w:pPr>
-              <w:spacing w:before="0" w:after="0" w:line="264" w:lineRule="auto"/>
-              <w:jc w:val="center"/>
-            </w:pPr>
-            <w:r>
-              <w:rPr>
-                <w:rFonts w:ascii="Arial" w:hAnsi="Arial"/>
-                <w:b w:val="0"/>
-                <w:i w:val="0"/>
-                <w:color w:val="17212B"/>
-                <w:sz w:val="15"/>
-              </w:rPr>
-              <w:t>$43,650</w:t>
-            </w:r>
-          </w:p>
-        </w:tc>
-      </w:tr>
-      <w:tr>
-        <w:tc>
-          <w:tcPr>
-            <w:tcW w:type="dxa" w:w="1650"/>
-            <w:shd w:fill="FAFBFC"/>
-            <w:vAlign w:val="center"/>
-            <w:tcMar>
-              <w:top w:w="100" w:type="dxa"/>
-              <w:start w:w="120" w:type="dxa"/>
-              <w:bottom w:w="100" w:type="dxa"/>
-              <w:end w:w="120" w:type="dxa"/>
-            </w:tcMar>
-          </w:tcPr>
-          <w:p>
-            <w:pPr>
-              <w:spacing w:before="0" w:after="0" w:line="264" w:lineRule="auto"/>
-              <w:jc w:val="left"/>
-            </w:pPr>
-            <w:r>
-              <w:rPr>
-                <w:rFonts w:ascii="Arial" w:hAnsi="Arial"/>
-                <w:b w:val="0"/>
-                <w:i w:val="0"/>
-                <w:color w:val="17212B"/>
-                <w:sz w:val="15"/>
-              </w:rPr>
-              <w:t>4</w:t>
-            </w:r>
-          </w:p>
-        </w:tc>
-        <w:tc>
-          <w:tcPr>
-            <w:tcW w:type="dxa" w:w="2600"/>
-            <w:shd w:fill="FAFBFC"/>
-            <w:vAlign w:val="center"/>
-            <w:tcMar>
-              <w:top w:w="100" w:type="dxa"/>
-              <w:start w:w="120" w:type="dxa"/>
-              <w:bottom w:w="100" w:type="dxa"/>
-              <w:end w:w="120" w:type="dxa"/>
-            </w:tcMar>
-          </w:tcPr>
-          <w:p>
-            <w:pPr>
-              <w:spacing w:before="0" w:after="0" w:line="264" w:lineRule="auto"/>
-              <w:jc w:val="center"/>
-            </w:pPr>
-            <w:r>
-              <w:rPr>
-                <w:rFonts w:ascii="Arial" w:hAnsi="Arial"/>
-                <w:b w:val="0"/>
-                <w:i w:val="0"/>
-                <w:color w:val="17212B"/>
-                <w:sz w:val="15"/>
-              </w:rPr>
-              <w:t>15-20 months</w:t>
-            </w:r>
-          </w:p>
-        </w:tc>
-        <w:tc>
-          <w:tcPr>
-            <w:tcW w:type="dxa" w:w="2900"/>
-            <w:shd w:fill="FAFBFC"/>
-            <w:vAlign w:val="center"/>
-            <w:tcMar>
-              <w:top w:w="100" w:type="dxa"/>
-              <w:start w:w="120" w:type="dxa"/>
-              <w:bottom w:w="100" w:type="dxa"/>
-              <w:end w:w="120" w:type="dxa"/>
-            </w:tcMar>
-          </w:tcPr>
-          <w:p>
-            <w:pPr>
-              <w:spacing w:before="0" w:after="0" w:line="264" w:lineRule="auto"/>
-              <w:jc w:val="center"/>
-            </w:pPr>
-            <w:r>
-              <w:rPr>
-                <w:rFonts w:ascii="Arial" w:hAnsi="Arial"/>
-                <w:b w:val="0"/>
-                <w:i w:val="0"/>
-                <w:color w:val="17212B"/>
-                <w:sz w:val="15"/>
-              </w:rPr>
-              <w:t>$13,150</w:t>
-            </w:r>
-          </w:p>
-        </w:tc>
-        <w:tc>
-          <w:tcPr>
-            <w:tcW w:type="dxa" w:w="3506"/>
-            <w:shd w:fill="FAFBFC"/>
-            <w:vAlign w:val="center"/>
-            <w:tcMar>
-              <w:top w:w="100" w:type="dxa"/>
-              <w:start w:w="120" w:type="dxa"/>
-              <w:bottom w:w="100" w:type="dxa"/>
-              <w:end w:w="120" w:type="dxa"/>
-            </w:tcMar>
-          </w:tcPr>
-          <w:p>
-            <w:pPr>
-              <w:spacing w:before="0" w:after="0" w:line="264" w:lineRule="auto"/>
-              <w:jc w:val="center"/>
-            </w:pPr>
-            <w:r>
-              <w:rPr>
-                <w:rFonts w:ascii="Arial" w:hAnsi="Arial"/>
-                <w:b w:val="0"/>
-                <w:i w:val="0"/>
-                <w:color w:val="17212B"/>
-                <w:sz w:val="15"/>
-              </w:rPr>
-              <w:t>$56,800</w:t>
-            </w:r>
-          </w:p>
-        </w:tc>
-      </w:tr>
-      <w:tr>
-        <w:tc>
-          <w:tcPr>
-            <w:tcW w:type="dxa" w:w="1650"/>
-            <w:vAlign w:val="center"/>
-            <w:tcMar>
-              <w:top w:w="100" w:type="dxa"/>
-              <w:start w:w="120" w:type="dxa"/>
-              <w:bottom w:w="100" w:type="dxa"/>
-              <w:end w:w="120" w:type="dxa"/>
-            </w:tcMar>
-          </w:tcPr>
-          <w:p>
-            <w:pPr>
-              <w:spacing w:before="0" w:after="0" w:line="264" w:lineRule="auto"/>
-              <w:jc w:val="left"/>
-            </w:pPr>
-            <w:r>
-              <w:rPr>
-                <w:rFonts w:ascii="Arial" w:hAnsi="Arial"/>
-                <w:b w:val="0"/>
-                <w:i w:val="0"/>
-                <w:color w:val="17212B"/>
-                <w:sz w:val="15"/>
-              </w:rPr>
-              <w:t>5</w:t>
-            </w:r>
-          </w:p>
-        </w:tc>
-        <w:tc>
-          <w:tcPr>
-            <w:tcW w:type="dxa" w:w="2600"/>
-            <w:vAlign w:val="center"/>
-            <w:tcMar>
-              <w:top w:w="100" w:type="dxa"/>
-              <w:start w:w="120" w:type="dxa"/>
-              <w:bottom w:w="100" w:type="dxa"/>
-              <w:end w:w="120" w:type="dxa"/>
-            </w:tcMar>
-          </w:tcPr>
-          <w:p>
-            <w:pPr>
-              <w:spacing w:before="0" w:after="0" w:line="264" w:lineRule="auto"/>
-              <w:jc w:val="center"/>
-            </w:pPr>
-            <w:r>
-              <w:rPr>
-                <w:rFonts w:ascii="Arial" w:hAnsi="Arial"/>
-                <w:b w:val="0"/>
-                <w:i w:val="0"/>
-                <w:color w:val="17212B"/>
-                <w:sz w:val="15"/>
-              </w:rPr>
-              <w:t>20-25 months</w:t>
-            </w:r>
-          </w:p>
-        </w:tc>
-        <w:tc>
-          <w:tcPr>
-            <w:tcW w:type="dxa" w:w="2900"/>
-            <w:vAlign w:val="center"/>
-            <w:tcMar>
-              <w:top w:w="100" w:type="dxa"/>
-              <w:start w:w="120" w:type="dxa"/>
-              <w:bottom w:w="100" w:type="dxa"/>
-              <w:end w:w="120" w:type="dxa"/>
-            </w:tcMar>
-          </w:tcPr>
-          <w:p>
-            <w:pPr>
-              <w:spacing w:before="0" w:after="0" w:line="264" w:lineRule="auto"/>
-              <w:jc w:val="center"/>
-            </w:pPr>
-            <w:r>
-              <w:rPr>
-                <w:rFonts w:ascii="Arial" w:hAnsi="Arial"/>
-                <w:b w:val="0"/>
-                <w:i w:val="0"/>
-                <w:color w:val="17212B"/>
-                <w:sz w:val="15"/>
-              </w:rPr>
-              <w:t>$13,150</w:t>
-            </w:r>
-          </w:p>
-        </w:tc>
-        <w:tc>
-          <w:tcPr>
-            <w:tcW w:type="dxa" w:w="3506"/>
-            <w:vAlign w:val="center"/>
-            <w:tcMar>
-              <w:top w:w="100" w:type="dxa"/>
-              <w:start w:w="120" w:type="dxa"/>
-              <w:bottom w:w="100" w:type="dxa"/>
-              <w:end w:w="120" w:type="dxa"/>
-            </w:tcMar>
-          </w:tcPr>
-          <w:p>
-            <w:pPr>
-              <w:spacing w:before="0" w:after="0" w:line="264" w:lineRule="auto"/>
-              <w:jc w:val="center"/>
-            </w:pPr>
-            <w:r>
-              <w:rPr>
-                <w:rFonts w:ascii="Arial" w:hAnsi="Arial"/>
-                <w:b w:val="0"/>
-                <w:i w:val="0"/>
-                <w:color w:val="17212B"/>
-                <w:sz w:val="15"/>
-              </w:rPr>
-              <w:t>$69,950</w:t>
-            </w:r>
-          </w:p>
-        </w:tc>
-      </w:tr>
-      <w:tr>
-        <w:tc>
-          <w:tcPr>
-            <w:tcW w:type="dxa" w:w="1650"/>
-            <w:shd w:fill="FAFBFC"/>
-            <w:vAlign w:val="center"/>
-            <w:tcMar>
-              <w:top w:w="100" w:type="dxa"/>
-              <w:start w:w="120" w:type="dxa"/>
-              <w:bottom w:w="100" w:type="dxa"/>
-              <w:end w:w="120" w:type="dxa"/>
-            </w:tcMar>
-          </w:tcPr>
-          <w:p>
-            <w:pPr>
-              <w:spacing w:before="0" w:after="0" w:line="264" w:lineRule="auto"/>
-              <w:jc w:val="left"/>
-            </w:pPr>
-            <w:r>
-              <w:rPr>
-                <w:rFonts w:ascii="Arial" w:hAnsi="Arial"/>
-                <w:b w:val="0"/>
-                <w:i w:val="0"/>
-                <w:color w:val="17212B"/>
-                <w:sz w:val="15"/>
-              </w:rPr>
-              <w:t>6</w:t>
-            </w:r>
-          </w:p>
-        </w:tc>
-        <w:tc>
-          <w:tcPr>
-            <w:tcW w:type="dxa" w:w="2600"/>
-            <w:shd w:fill="FAFBFC"/>
-            <w:vAlign w:val="center"/>
-            <w:tcMar>
-              <w:top w:w="100" w:type="dxa"/>
-              <w:start w:w="120" w:type="dxa"/>
-              <w:bottom w:w="100" w:type="dxa"/>
-              <w:end w:w="120" w:type="dxa"/>
-            </w:tcMar>
-          </w:tcPr>
-          <w:p>
-            <w:pPr>
-              <w:spacing w:before="0" w:after="0" w:line="264" w:lineRule="auto"/>
-              <w:jc w:val="center"/>
-            </w:pPr>
-            <w:r>
-              <w:rPr>
-                <w:rFonts w:ascii="Arial" w:hAnsi="Arial"/>
-                <w:b w:val="0"/>
-                <w:i w:val="0"/>
-                <w:color w:val="17212B"/>
-                <w:sz w:val="15"/>
-              </w:rPr>
-              <w:t>25-30 months</w:t>
-            </w:r>
-          </w:p>
-        </w:tc>
-        <w:tc>
-          <w:tcPr>
-            <w:tcW w:type="dxa" w:w="2900"/>
-            <w:shd w:fill="FAFBFC"/>
-            <w:vAlign w:val="center"/>
-            <w:tcMar>
-              <w:top w:w="100" w:type="dxa"/>
-              <w:start w:w="120" w:type="dxa"/>
-              <w:bottom w:w="100" w:type="dxa"/>
-              <w:end w:w="120" w:type="dxa"/>
-            </w:tcMar>
-          </w:tcPr>
-          <w:p>
-            <w:pPr>
-              <w:spacing w:before="0" w:after="0" w:line="264" w:lineRule="auto"/>
-              <w:jc w:val="center"/>
-            </w:pPr>
-            <w:r>
-              <w:rPr>
-                <w:rFonts w:ascii="Arial" w:hAnsi="Arial"/>
-                <w:b w:val="0"/>
-                <w:i w:val="0"/>
-                <w:color w:val="17212B"/>
-                <w:sz w:val="15"/>
-              </w:rPr>
-              <w:t>$13,150</w:t>
-            </w:r>
-          </w:p>
-        </w:tc>
-        <w:tc>
-          <w:tcPr>
-            <w:tcW w:type="dxa" w:w="3506"/>
-            <w:shd w:fill="FAFBFC"/>
-            <w:vAlign w:val="center"/>
-            <w:tcMar>
-              <w:top w:w="100" w:type="dxa"/>
-              <w:start w:w="120" w:type="dxa"/>
-              <w:bottom w:w="100" w:type="dxa"/>
-              <w:end w:w="120" w:type="dxa"/>
-            </w:tcMar>
-          </w:tcPr>
-          <w:p>
-            <w:pPr>
-              <w:spacing w:before="0" w:after="0" w:line="264" w:lineRule="auto"/>
-              <w:jc w:val="center"/>
-            </w:pPr>
-            <w:r>
-              <w:rPr>
-                <w:rFonts w:ascii="Arial" w:hAnsi="Arial"/>
-                <w:b w:val="0"/>
-                <w:i w:val="0"/>
-                <w:color w:val="17212B"/>
-                <w:sz w:val="15"/>
-              </w:rPr>
-              <w:t>$83,100</w:t>
-            </w:r>
-          </w:p>
-        </w:tc>
-      </w:tr>
-      <w:tr>
-        <w:tc>
-          <w:tcPr>
-            <w:tcW w:type="dxa" w:w="1650"/>
-            <w:vAlign w:val="center"/>
-            <w:tcMar>
-              <w:top w:w="100" w:type="dxa"/>
-              <w:start w:w="120" w:type="dxa"/>
-              <w:bottom w:w="100" w:type="dxa"/>
-              <w:end w:w="120" w:type="dxa"/>
-            </w:tcMar>
-          </w:tcPr>
-          <w:p>
-            <w:pPr>
-              <w:spacing w:before="0" w:after="0" w:line="264" w:lineRule="auto"/>
-              <w:jc w:val="left"/>
-            </w:pPr>
-            <w:r>
-              <w:rPr>
-                <w:rFonts w:ascii="Arial" w:hAnsi="Arial"/>
-                <w:b w:val="0"/>
-                <w:i w:val="0"/>
-                <w:color w:val="17212B"/>
-                <w:sz w:val="15"/>
-              </w:rPr>
-              <w:t>7</w:t>
-            </w:r>
-          </w:p>
-        </w:tc>
-        <w:tc>
-          <w:tcPr>
-            <w:tcW w:type="dxa" w:w="2600"/>
-            <w:vAlign w:val="center"/>
-            <w:tcMar>
-              <w:top w:w="100" w:type="dxa"/>
-              <w:start w:w="120" w:type="dxa"/>
-              <w:bottom w:w="100" w:type="dxa"/>
-              <w:end w:w="120" w:type="dxa"/>
-            </w:tcMar>
-          </w:tcPr>
-          <w:p>
-            <w:pPr>
-              <w:spacing w:before="0" w:after="0" w:line="264" w:lineRule="auto"/>
-              <w:jc w:val="center"/>
-            </w:pPr>
-            <w:r>
-              <w:rPr>
-                <w:rFonts w:ascii="Arial" w:hAnsi="Arial"/>
-                <w:b w:val="0"/>
-                <w:i w:val="0"/>
-                <w:color w:val="17212B"/>
-                <w:sz w:val="15"/>
-              </w:rPr>
-              <w:t>30-35 months</w:t>
-            </w:r>
-          </w:p>
-        </w:tc>
-        <w:tc>
-          <w:tcPr>
-            <w:tcW w:type="dxa" w:w="2900"/>
-            <w:vAlign w:val="center"/>
-            <w:tcMar>
-              <w:top w:w="100" w:type="dxa"/>
-              <w:start w:w="120" w:type="dxa"/>
-              <w:bottom w:w="100" w:type="dxa"/>
-              <w:end w:w="120" w:type="dxa"/>
-            </w:tcMar>
-          </w:tcPr>
-          <w:p>
-            <w:pPr>
-              <w:spacing w:before="0" w:after="0" w:line="264" w:lineRule="auto"/>
-              <w:jc w:val="center"/>
-            </w:pPr>
-            <w:r>
-              <w:rPr>
-                <w:rFonts w:ascii="Arial" w:hAnsi="Arial"/>
-                <w:b w:val="0"/>
-                <w:i w:val="0"/>
-                <w:color w:val="17212B"/>
-                <w:sz w:val="15"/>
-              </w:rPr>
-              <w:t>$13,150</w:t>
-            </w:r>
-          </w:p>
-        </w:tc>
-        <w:tc>
-          <w:tcPr>
-            <w:tcW w:type="dxa" w:w="3506"/>
-            <w:vAlign w:val="center"/>
-            <w:tcMar>
-              <w:top w:w="100" w:type="dxa"/>
-              <w:start w:w="120" w:type="dxa"/>
-              <w:bottom w:w="100" w:type="dxa"/>
-              <w:end w:w="120" w:type="dxa"/>
-            </w:tcMar>
-          </w:tcPr>
-          <w:p>
-            <w:pPr>
-              <w:spacing w:before="0" w:after="0" w:line="264" w:lineRule="auto"/>
-              <w:jc w:val="center"/>
-            </w:pPr>
-            <w:r>
-              <w:rPr>
-                <w:rFonts w:ascii="Arial" w:hAnsi="Arial"/>
-                <w:b w:val="0"/>
-                <w:i w:val="0"/>
-                <w:color w:val="17212B"/>
-                <w:sz w:val="15"/>
-              </w:rPr>
-              <w:t>$96,250</w:t>
-            </w:r>
-          </w:p>
-        </w:tc>
-      </w:tr>
-    </w:tbl>
-    <w:p>
-      <w:pPr>
-        <w:spacing w:after="40"/>
       </w:pPr>
     </w:p>
     <w:p>
@@ -9184,6 +8224,1858 @@
                 <w:color w:val="FFFFFF"/>
                 <w:sz w:val="22"/>
               </w:rPr>
+              <w:t>Investor Protection Reserve</w:t>
+            </w:r>
+          </w:p>
+        </w:tc>
+      </w:tr>
+    </w:tbl>
+    <w:p>
+      <w:pPr>
+        <w:spacing w:before="0" w:after="20" w:line="240" w:lineRule="auto"/>
+      </w:pPr>
+    </w:p>
+    <w:p>
+      <w:pPr>
+        <w:spacing w:before="0" w:after="100" w:line="300" w:lineRule="auto"/>
+      </w:pPr>
+      <w:r>
+        <w:rPr>
+          <w:rFonts w:ascii="Arial" w:hAnsi="Arial"/>
+          <w:b w:val="0"/>
+          <w:i w:val="0"/>
+          <w:color w:val="17212B"/>
+          <w:sz w:val="17"/>
+        </w:rPr>
+        <w:t>Rate: 44% of the farmer share. Required reserve after each successful cycle: max($10,000; $50,000 - investor cash actually received). The final $10,000 is released only after completion and performance of all obligations.</w:t>
+      </w:r>
+    </w:p>
+    <w:tbl>
+      <w:tblPr>
+        <w:tblStyle w:val="TableGrid"/>
+        <w:tblW w:type="dxa" w:w="10656"/>
+        <w:jc w:val="center"/>
+        <w:tblLayout w:type="fixed"/>
+        <w:tblLook w:firstColumn="1" w:firstRow="1" w:lastColumn="0" w:lastRow="0" w:noHBand="0" w:noVBand="1" w:val="04A0"/>
+        <w:tblInd w:w="120" w:type="dxa"/>
+      </w:tblPr>
+      <w:tblGrid>
+        <w:gridCol w:w="1250"/>
+        <w:gridCol w:w="1850"/>
+        <w:gridCol w:w="1750"/>
+        <w:gridCol w:w="1750"/>
+        <w:gridCol w:w="1700"/>
+        <w:gridCol w:w="2356"/>
+      </w:tblGrid>
+      <w:tr>
+        <w:trPr>
+          <w:tblHeader w:val="true"/>
+        </w:trPr>
+        <w:tc>
+          <w:tcPr>
+            <w:tcW w:type="dxa" w:w="1250"/>
+            <w:shd w:fill="1769C2"/>
+            <w:vAlign w:val="center"/>
+            <w:tcMar>
+              <w:top w:w="100" w:type="dxa"/>
+              <w:start w:w="120" w:type="dxa"/>
+              <w:bottom w:w="100" w:type="dxa"/>
+              <w:end w:w="120" w:type="dxa"/>
+            </w:tcMar>
+          </w:tcPr>
+          <w:p>
+            <w:pPr>
+              <w:spacing w:before="0" w:after="0" w:line="252" w:lineRule="auto"/>
+              <w:jc w:val="center"/>
+            </w:pPr>
+            <w:r>
+              <w:rPr>
+                <w:rFonts w:ascii="Arial" w:hAnsi="Arial"/>
+                <w:b/>
+                <w:i w:val="0"/>
+                <w:color w:val="FFFFFF"/>
+                <w:sz w:val="17"/>
+              </w:rPr>
+              <w:t>Cycle</w:t>
+            </w:r>
+          </w:p>
+        </w:tc>
+        <w:tc>
+          <w:tcPr>
+            <w:tcW w:type="dxa" w:w="1850"/>
+            <w:shd w:fill="1769C2"/>
+            <w:vAlign w:val="center"/>
+            <w:tcMar>
+              <w:top w:w="100" w:type="dxa"/>
+              <w:start w:w="120" w:type="dxa"/>
+              <w:bottom w:w="100" w:type="dxa"/>
+              <w:end w:w="120" w:type="dxa"/>
+            </w:tcMar>
+          </w:tcPr>
+          <w:p>
+            <w:pPr>
+              <w:spacing w:before="0" w:after="0" w:line="252" w:lineRule="auto"/>
+              <w:jc w:val="center"/>
+            </w:pPr>
+            <w:r>
+              <w:rPr>
+                <w:rFonts w:ascii="Arial" w:hAnsi="Arial"/>
+                <w:b/>
+                <w:i w:val="0"/>
+                <w:color w:val="FFFFFF"/>
+                <w:sz w:val="17"/>
+              </w:rPr>
+              <w:t>Investor cash received</w:t>
+            </w:r>
+          </w:p>
+        </w:tc>
+        <w:tc>
+          <w:tcPr>
+            <w:tcW w:type="dxa" w:w="1750"/>
+            <w:shd w:fill="1769C2"/>
+            <w:vAlign w:val="center"/>
+            <w:tcMar>
+              <w:top w:w="100" w:type="dxa"/>
+              <w:start w:w="120" w:type="dxa"/>
+              <w:bottom w:w="100" w:type="dxa"/>
+              <w:end w:w="120" w:type="dxa"/>
+            </w:tcMar>
+          </w:tcPr>
+          <w:p>
+            <w:pPr>
+              <w:spacing w:before="0" w:after="0" w:line="252" w:lineRule="auto"/>
+              <w:jc w:val="center"/>
+            </w:pPr>
+            <w:r>
+              <w:rPr>
+                <w:rFonts w:ascii="Arial" w:hAnsi="Arial"/>
+                <w:b/>
+                <w:i w:val="0"/>
+                <w:color w:val="FFFFFF"/>
+                <w:sz w:val="17"/>
+              </w:rPr>
+              <w:t>Reserve contribution</w:t>
+            </w:r>
+          </w:p>
+        </w:tc>
+        <w:tc>
+          <w:tcPr>
+            <w:tcW w:type="dxa" w:w="1750"/>
+            <w:shd w:fill="1769C2"/>
+            <w:vAlign w:val="center"/>
+            <w:tcMar>
+              <w:top w:w="100" w:type="dxa"/>
+              <w:start w:w="120" w:type="dxa"/>
+              <w:bottom w:w="100" w:type="dxa"/>
+              <w:end w:w="120" w:type="dxa"/>
+            </w:tcMar>
+          </w:tcPr>
+          <w:p>
+            <w:pPr>
+              <w:spacing w:before="0" w:after="0" w:line="252" w:lineRule="auto"/>
+              <w:jc w:val="center"/>
+            </w:pPr>
+            <w:r>
+              <w:rPr>
+                <w:rFonts w:ascii="Arial" w:hAnsi="Arial"/>
+                <w:b/>
+                <w:i w:val="0"/>
+                <w:color w:val="FFFFFF"/>
+                <w:sz w:val="17"/>
+              </w:rPr>
+              <w:t>Released to farmer</w:t>
+            </w:r>
+          </w:p>
+        </w:tc>
+        <w:tc>
+          <w:tcPr>
+            <w:tcW w:type="dxa" w:w="1700"/>
+            <w:shd w:fill="1769C2"/>
+            <w:vAlign w:val="center"/>
+            <w:tcMar>
+              <w:top w:w="100" w:type="dxa"/>
+              <w:start w:w="120" w:type="dxa"/>
+              <w:bottom w:w="100" w:type="dxa"/>
+              <w:end w:w="120" w:type="dxa"/>
+            </w:tcMar>
+          </w:tcPr>
+          <w:p>
+            <w:pPr>
+              <w:spacing w:before="0" w:after="0" w:line="252" w:lineRule="auto"/>
+              <w:jc w:val="center"/>
+            </w:pPr>
+            <w:r>
+              <w:rPr>
+                <w:rFonts w:ascii="Arial" w:hAnsi="Arial"/>
+                <w:b/>
+                <w:i w:val="0"/>
+                <w:color w:val="FFFFFF"/>
+                <w:sz w:val="17"/>
+              </w:rPr>
+              <w:t>Reserve balance</w:t>
+            </w:r>
+          </w:p>
+        </w:tc>
+        <w:tc>
+          <w:tcPr>
+            <w:tcW w:type="dxa" w:w="2356"/>
+            <w:shd w:fill="1769C2"/>
+            <w:vAlign w:val="center"/>
+            <w:tcMar>
+              <w:top w:w="100" w:type="dxa"/>
+              <w:start w:w="120" w:type="dxa"/>
+              <w:bottom w:w="100" w:type="dxa"/>
+              <w:end w:w="120" w:type="dxa"/>
+            </w:tcMar>
+          </w:tcPr>
+          <w:p>
+            <w:pPr>
+              <w:spacing w:before="0" w:after="0" w:line="252" w:lineRule="auto"/>
+              <w:jc w:val="center"/>
+            </w:pPr>
+            <w:r>
+              <w:rPr>
+                <w:rFonts w:ascii="Arial" w:hAnsi="Arial"/>
+                <w:b/>
+                <w:i w:val="0"/>
+                <w:color w:val="FFFFFF"/>
+                <w:sz w:val="17"/>
+              </w:rPr>
+              <w:t>Farmer cash available</w:t>
+            </w:r>
+          </w:p>
+        </w:tc>
+      </w:tr>
+      <w:tr>
+        <w:tc>
+          <w:tcPr>
+            <w:tcW w:type="dxa" w:w="1250"/>
+            <w:vAlign w:val="center"/>
+            <w:tcMar>
+              <w:top w:w="100" w:type="dxa"/>
+              <w:start w:w="120" w:type="dxa"/>
+              <w:bottom w:w="100" w:type="dxa"/>
+              <w:end w:w="120" w:type="dxa"/>
+            </w:tcMar>
+          </w:tcPr>
+          <w:p>
+            <w:pPr>
+              <w:spacing w:before="0" w:after="0" w:line="264" w:lineRule="auto"/>
+              <w:jc w:val="left"/>
+            </w:pPr>
+            <w:r>
+              <w:rPr>
+                <w:rFonts w:ascii="Arial" w:hAnsi="Arial"/>
+                <w:b w:val="0"/>
+                <w:i w:val="0"/>
+                <w:color w:val="17212B"/>
+                <w:sz w:val="14"/>
+              </w:rPr>
+              <w:t>Cycle 1</w:t>
+            </w:r>
+          </w:p>
+        </w:tc>
+        <w:tc>
+          <w:tcPr>
+            <w:tcW w:type="dxa" w:w="1850"/>
+            <w:vAlign w:val="center"/>
+            <w:tcMar>
+              <w:top w:w="100" w:type="dxa"/>
+              <w:start w:w="120" w:type="dxa"/>
+              <w:bottom w:w="100" w:type="dxa"/>
+              <w:end w:w="120" w:type="dxa"/>
+            </w:tcMar>
+          </w:tcPr>
+          <w:p>
+            <w:pPr>
+              <w:spacing w:before="0" w:after="0" w:line="264" w:lineRule="auto"/>
+              <w:jc w:val="center"/>
+            </w:pPr>
+            <w:r>
+              <w:rPr>
+                <w:rFonts w:ascii="Arial" w:hAnsi="Arial"/>
+                <w:b w:val="0"/>
+                <w:i w:val="0"/>
+                <w:color w:val="17212B"/>
+                <w:sz w:val="14"/>
+              </w:rPr>
+              <w:t>$9,600</w:t>
+            </w:r>
+          </w:p>
+        </w:tc>
+        <w:tc>
+          <w:tcPr>
+            <w:tcW w:type="dxa" w:w="1750"/>
+            <w:vAlign w:val="center"/>
+            <w:tcMar>
+              <w:top w:w="100" w:type="dxa"/>
+              <w:start w:w="120" w:type="dxa"/>
+              <w:bottom w:w="100" w:type="dxa"/>
+              <w:end w:w="120" w:type="dxa"/>
+            </w:tcMar>
+          </w:tcPr>
+          <w:p>
+            <w:pPr>
+              <w:spacing w:before="0" w:after="0" w:line="264" w:lineRule="auto"/>
+              <w:jc w:val="center"/>
+            </w:pPr>
+            <w:r>
+              <w:rPr>
+                <w:rFonts w:ascii="Arial" w:hAnsi="Arial"/>
+                <w:b w:val="0"/>
+                <w:i w:val="0"/>
+                <w:color w:val="17212B"/>
+                <w:sz w:val="14"/>
+              </w:rPr>
+              <w:t>$7,920</w:t>
+            </w:r>
+          </w:p>
+        </w:tc>
+        <w:tc>
+          <w:tcPr>
+            <w:tcW w:type="dxa" w:w="1750"/>
+            <w:vAlign w:val="center"/>
+            <w:tcMar>
+              <w:top w:w="100" w:type="dxa"/>
+              <w:start w:w="120" w:type="dxa"/>
+              <w:bottom w:w="100" w:type="dxa"/>
+              <w:end w:w="120" w:type="dxa"/>
+            </w:tcMar>
+          </w:tcPr>
+          <w:p>
+            <w:pPr>
+              <w:spacing w:before="0" w:after="0" w:line="264" w:lineRule="auto"/>
+              <w:jc w:val="center"/>
+            </w:pPr>
+            <w:r>
+              <w:rPr>
+                <w:rFonts w:ascii="Arial" w:hAnsi="Arial"/>
+                <w:b w:val="0"/>
+                <w:i w:val="0"/>
+                <w:color w:val="17212B"/>
+                <w:sz w:val="14"/>
+              </w:rPr>
+              <w:t>$0</w:t>
+            </w:r>
+          </w:p>
+        </w:tc>
+        <w:tc>
+          <w:tcPr>
+            <w:tcW w:type="dxa" w:w="1700"/>
+            <w:vAlign w:val="center"/>
+            <w:tcMar>
+              <w:top w:w="100" w:type="dxa"/>
+              <w:start w:w="120" w:type="dxa"/>
+              <w:bottom w:w="100" w:type="dxa"/>
+              <w:end w:w="120" w:type="dxa"/>
+            </w:tcMar>
+          </w:tcPr>
+          <w:p>
+            <w:pPr>
+              <w:spacing w:before="0" w:after="0" w:line="264" w:lineRule="auto"/>
+              <w:jc w:val="center"/>
+            </w:pPr>
+            <w:r>
+              <w:rPr>
+                <w:rFonts w:ascii="Arial" w:hAnsi="Arial"/>
+                <w:b w:val="0"/>
+                <w:i w:val="0"/>
+                <w:color w:val="17212B"/>
+                <w:sz w:val="14"/>
+              </w:rPr>
+              <w:t>$7,920</w:t>
+            </w:r>
+          </w:p>
+        </w:tc>
+        <w:tc>
+          <w:tcPr>
+            <w:tcW w:type="dxa" w:w="2356"/>
+            <w:vAlign w:val="center"/>
+            <w:tcMar>
+              <w:top w:w="100" w:type="dxa"/>
+              <w:start w:w="120" w:type="dxa"/>
+              <w:bottom w:w="100" w:type="dxa"/>
+              <w:end w:w="120" w:type="dxa"/>
+            </w:tcMar>
+          </w:tcPr>
+          <w:p>
+            <w:pPr>
+              <w:spacing w:before="0" w:after="0" w:line="264" w:lineRule="auto"/>
+              <w:jc w:val="center"/>
+            </w:pPr>
+            <w:r>
+              <w:rPr>
+                <w:rFonts w:ascii="Arial" w:hAnsi="Arial"/>
+                <w:b w:val="0"/>
+                <w:i w:val="0"/>
+                <w:color w:val="17212B"/>
+                <w:sz w:val="14"/>
+              </w:rPr>
+              <w:t>$7,330</w:t>
+            </w:r>
+          </w:p>
+        </w:tc>
+      </w:tr>
+      <w:tr>
+        <w:tc>
+          <w:tcPr>
+            <w:tcW w:type="dxa" w:w="1250"/>
+            <w:shd w:fill="FAFBFC"/>
+            <w:vAlign w:val="center"/>
+            <w:tcMar>
+              <w:top w:w="100" w:type="dxa"/>
+              <w:start w:w="120" w:type="dxa"/>
+              <w:bottom w:w="100" w:type="dxa"/>
+              <w:end w:w="120" w:type="dxa"/>
+            </w:tcMar>
+          </w:tcPr>
+          <w:p>
+            <w:pPr>
+              <w:spacing w:before="0" w:after="0" w:line="264" w:lineRule="auto"/>
+              <w:jc w:val="left"/>
+            </w:pPr>
+            <w:r>
+              <w:rPr>
+                <w:rFonts w:ascii="Arial" w:hAnsi="Arial"/>
+                <w:b w:val="0"/>
+                <w:i w:val="0"/>
+                <w:color w:val="17212B"/>
+                <w:sz w:val="14"/>
+              </w:rPr>
+              <w:t>Cycle 2</w:t>
+            </w:r>
+          </w:p>
+        </w:tc>
+        <w:tc>
+          <w:tcPr>
+            <w:tcW w:type="dxa" w:w="1850"/>
+            <w:shd w:fill="FAFBFC"/>
+            <w:vAlign w:val="center"/>
+            <w:tcMar>
+              <w:top w:w="100" w:type="dxa"/>
+              <w:start w:w="120" w:type="dxa"/>
+              <w:bottom w:w="100" w:type="dxa"/>
+              <w:end w:w="120" w:type="dxa"/>
+            </w:tcMar>
+          </w:tcPr>
+          <w:p>
+            <w:pPr>
+              <w:spacing w:before="0" w:after="0" w:line="264" w:lineRule="auto"/>
+              <w:jc w:val="center"/>
+            </w:pPr>
+            <w:r>
+              <w:rPr>
+                <w:rFonts w:ascii="Arial" w:hAnsi="Arial"/>
+                <w:b w:val="0"/>
+                <w:i w:val="0"/>
+                <w:color w:val="17212B"/>
+                <w:sz w:val="14"/>
+              </w:rPr>
+              <w:t>$19,200</w:t>
+            </w:r>
+          </w:p>
+        </w:tc>
+        <w:tc>
+          <w:tcPr>
+            <w:tcW w:type="dxa" w:w="1750"/>
+            <w:shd w:fill="FAFBFC"/>
+            <w:vAlign w:val="center"/>
+            <w:tcMar>
+              <w:top w:w="100" w:type="dxa"/>
+              <w:start w:w="120" w:type="dxa"/>
+              <w:bottom w:w="100" w:type="dxa"/>
+              <w:end w:w="120" w:type="dxa"/>
+            </w:tcMar>
+          </w:tcPr>
+          <w:p>
+            <w:pPr>
+              <w:spacing w:before="0" w:after="0" w:line="264" w:lineRule="auto"/>
+              <w:jc w:val="center"/>
+            </w:pPr>
+            <w:r>
+              <w:rPr>
+                <w:rFonts w:ascii="Arial" w:hAnsi="Arial"/>
+                <w:b w:val="0"/>
+                <w:i w:val="0"/>
+                <w:color w:val="17212B"/>
+                <w:sz w:val="14"/>
+              </w:rPr>
+              <w:t>$7,920</w:t>
+            </w:r>
+          </w:p>
+        </w:tc>
+        <w:tc>
+          <w:tcPr>
+            <w:tcW w:type="dxa" w:w="1750"/>
+            <w:shd w:fill="FAFBFC"/>
+            <w:vAlign w:val="center"/>
+            <w:tcMar>
+              <w:top w:w="100" w:type="dxa"/>
+              <w:start w:w="120" w:type="dxa"/>
+              <w:bottom w:w="100" w:type="dxa"/>
+              <w:end w:w="120" w:type="dxa"/>
+            </w:tcMar>
+          </w:tcPr>
+          <w:p>
+            <w:pPr>
+              <w:spacing w:before="0" w:after="0" w:line="264" w:lineRule="auto"/>
+              <w:jc w:val="center"/>
+            </w:pPr>
+            <w:r>
+              <w:rPr>
+                <w:rFonts w:ascii="Arial" w:hAnsi="Arial"/>
+                <w:b w:val="0"/>
+                <w:i w:val="0"/>
+                <w:color w:val="17212B"/>
+                <w:sz w:val="14"/>
+              </w:rPr>
+              <w:t>$0</w:t>
+            </w:r>
+          </w:p>
+        </w:tc>
+        <w:tc>
+          <w:tcPr>
+            <w:tcW w:type="dxa" w:w="1700"/>
+            <w:shd w:fill="FAFBFC"/>
+            <w:vAlign w:val="center"/>
+            <w:tcMar>
+              <w:top w:w="100" w:type="dxa"/>
+              <w:start w:w="120" w:type="dxa"/>
+              <w:bottom w:w="100" w:type="dxa"/>
+              <w:end w:w="120" w:type="dxa"/>
+            </w:tcMar>
+          </w:tcPr>
+          <w:p>
+            <w:pPr>
+              <w:spacing w:before="0" w:after="0" w:line="264" w:lineRule="auto"/>
+              <w:jc w:val="center"/>
+            </w:pPr>
+            <w:r>
+              <w:rPr>
+                <w:rFonts w:ascii="Arial" w:hAnsi="Arial"/>
+                <w:b w:val="0"/>
+                <w:i w:val="0"/>
+                <w:color w:val="17212B"/>
+                <w:sz w:val="14"/>
+              </w:rPr>
+              <w:t>$15,840</w:t>
+            </w:r>
+          </w:p>
+        </w:tc>
+        <w:tc>
+          <w:tcPr>
+            <w:tcW w:type="dxa" w:w="2356"/>
+            <w:shd w:fill="FAFBFC"/>
+            <w:vAlign w:val="center"/>
+            <w:tcMar>
+              <w:top w:w="100" w:type="dxa"/>
+              <w:start w:w="120" w:type="dxa"/>
+              <w:bottom w:w="100" w:type="dxa"/>
+              <w:end w:w="120" w:type="dxa"/>
+            </w:tcMar>
+          </w:tcPr>
+          <w:p>
+            <w:pPr>
+              <w:spacing w:before="0" w:after="0" w:line="264" w:lineRule="auto"/>
+              <w:jc w:val="center"/>
+            </w:pPr>
+            <w:r>
+              <w:rPr>
+                <w:rFonts w:ascii="Arial" w:hAnsi="Arial"/>
+                <w:b w:val="0"/>
+                <w:i w:val="0"/>
+                <w:color w:val="17212B"/>
+                <w:sz w:val="14"/>
+              </w:rPr>
+              <w:t>$7,330</w:t>
+            </w:r>
+          </w:p>
+        </w:tc>
+      </w:tr>
+      <w:tr>
+        <w:tc>
+          <w:tcPr>
+            <w:tcW w:type="dxa" w:w="1250"/>
+            <w:vAlign w:val="center"/>
+            <w:tcMar>
+              <w:top w:w="100" w:type="dxa"/>
+              <w:start w:w="120" w:type="dxa"/>
+              <w:bottom w:w="100" w:type="dxa"/>
+              <w:end w:w="120" w:type="dxa"/>
+            </w:tcMar>
+          </w:tcPr>
+          <w:p>
+            <w:pPr>
+              <w:spacing w:before="0" w:after="0" w:line="264" w:lineRule="auto"/>
+              <w:jc w:val="left"/>
+            </w:pPr>
+            <w:r>
+              <w:rPr>
+                <w:rFonts w:ascii="Arial" w:hAnsi="Arial"/>
+                <w:b w:val="0"/>
+                <w:i w:val="0"/>
+                <w:color w:val="17212B"/>
+                <w:sz w:val="14"/>
+              </w:rPr>
+              <w:t>Cycle 3</w:t>
+            </w:r>
+          </w:p>
+        </w:tc>
+        <w:tc>
+          <w:tcPr>
+            <w:tcW w:type="dxa" w:w="1850"/>
+            <w:vAlign w:val="center"/>
+            <w:tcMar>
+              <w:top w:w="100" w:type="dxa"/>
+              <w:start w:w="120" w:type="dxa"/>
+              <w:bottom w:w="100" w:type="dxa"/>
+              <w:end w:w="120" w:type="dxa"/>
+            </w:tcMar>
+          </w:tcPr>
+          <w:p>
+            <w:pPr>
+              <w:spacing w:before="0" w:after="0" w:line="264" w:lineRule="auto"/>
+              <w:jc w:val="center"/>
+            </w:pPr>
+            <w:r>
+              <w:rPr>
+                <w:rFonts w:ascii="Arial" w:hAnsi="Arial"/>
+                <w:b w:val="0"/>
+                <w:i w:val="0"/>
+                <w:color w:val="17212B"/>
+                <w:sz w:val="14"/>
+              </w:rPr>
+              <w:t>$27,680</w:t>
+            </w:r>
+          </w:p>
+        </w:tc>
+        <w:tc>
+          <w:tcPr>
+            <w:tcW w:type="dxa" w:w="1750"/>
+            <w:vAlign w:val="center"/>
+            <w:tcMar>
+              <w:top w:w="100" w:type="dxa"/>
+              <w:start w:w="120" w:type="dxa"/>
+              <w:bottom w:w="100" w:type="dxa"/>
+              <w:end w:w="120" w:type="dxa"/>
+            </w:tcMar>
+          </w:tcPr>
+          <w:p>
+            <w:pPr>
+              <w:spacing w:before="0" w:after="0" w:line="264" w:lineRule="auto"/>
+              <w:jc w:val="center"/>
+            </w:pPr>
+            <w:r>
+              <w:rPr>
+                <w:rFonts w:ascii="Arial" w:hAnsi="Arial"/>
+                <w:b w:val="0"/>
+                <w:i w:val="0"/>
+                <w:color w:val="17212B"/>
+                <w:sz w:val="14"/>
+              </w:rPr>
+              <w:t>$6,996</w:t>
+            </w:r>
+          </w:p>
+        </w:tc>
+        <w:tc>
+          <w:tcPr>
+            <w:tcW w:type="dxa" w:w="1750"/>
+            <w:vAlign w:val="center"/>
+            <w:tcMar>
+              <w:top w:w="100" w:type="dxa"/>
+              <w:start w:w="120" w:type="dxa"/>
+              <w:bottom w:w="100" w:type="dxa"/>
+              <w:end w:w="120" w:type="dxa"/>
+            </w:tcMar>
+          </w:tcPr>
+          <w:p>
+            <w:pPr>
+              <w:spacing w:before="0" w:after="0" w:line="264" w:lineRule="auto"/>
+              <w:jc w:val="center"/>
+            </w:pPr>
+            <w:r>
+              <w:rPr>
+                <w:rFonts w:ascii="Arial" w:hAnsi="Arial"/>
+                <w:b w:val="0"/>
+                <w:i w:val="0"/>
+                <w:color w:val="17212B"/>
+                <w:sz w:val="14"/>
+              </w:rPr>
+              <w:t>$516</w:t>
+            </w:r>
+          </w:p>
+        </w:tc>
+        <w:tc>
+          <w:tcPr>
+            <w:tcW w:type="dxa" w:w="1700"/>
+            <w:vAlign w:val="center"/>
+            <w:tcMar>
+              <w:top w:w="100" w:type="dxa"/>
+              <w:start w:w="120" w:type="dxa"/>
+              <w:bottom w:w="100" w:type="dxa"/>
+              <w:end w:w="120" w:type="dxa"/>
+            </w:tcMar>
+          </w:tcPr>
+          <w:p>
+            <w:pPr>
+              <w:spacing w:before="0" w:after="0" w:line="264" w:lineRule="auto"/>
+              <w:jc w:val="center"/>
+            </w:pPr>
+            <w:r>
+              <w:rPr>
+                <w:rFonts w:ascii="Arial" w:hAnsi="Arial"/>
+                <w:b w:val="0"/>
+                <w:i w:val="0"/>
+                <w:color w:val="17212B"/>
+                <w:sz w:val="14"/>
+              </w:rPr>
+              <w:t>$22,320</w:t>
+            </w:r>
+          </w:p>
+        </w:tc>
+        <w:tc>
+          <w:tcPr>
+            <w:tcW w:type="dxa" w:w="2356"/>
+            <w:vAlign w:val="center"/>
+            <w:tcMar>
+              <w:top w:w="100" w:type="dxa"/>
+              <w:start w:w="120" w:type="dxa"/>
+              <w:bottom w:w="100" w:type="dxa"/>
+              <w:end w:w="120" w:type="dxa"/>
+            </w:tcMar>
+          </w:tcPr>
+          <w:p>
+            <w:pPr>
+              <w:spacing w:before="0" w:after="0" w:line="264" w:lineRule="auto"/>
+              <w:jc w:val="center"/>
+            </w:pPr>
+            <w:r>
+              <w:rPr>
+                <w:rFonts w:ascii="Arial" w:hAnsi="Arial"/>
+                <w:b w:val="0"/>
+                <w:i w:val="0"/>
+                <w:color w:val="17212B"/>
+                <w:sz w:val="14"/>
+              </w:rPr>
+              <w:t>$6,670</w:t>
+            </w:r>
+          </w:p>
+        </w:tc>
+      </w:tr>
+      <w:tr>
+        <w:tc>
+          <w:tcPr>
+            <w:tcW w:type="dxa" w:w="1250"/>
+            <w:shd w:fill="FAFBFC"/>
+            <w:vAlign w:val="center"/>
+            <w:tcMar>
+              <w:top w:w="100" w:type="dxa"/>
+              <w:start w:w="120" w:type="dxa"/>
+              <w:bottom w:w="100" w:type="dxa"/>
+              <w:end w:w="120" w:type="dxa"/>
+            </w:tcMar>
+          </w:tcPr>
+          <w:p>
+            <w:pPr>
+              <w:spacing w:before="0" w:after="0" w:line="264" w:lineRule="auto"/>
+              <w:jc w:val="left"/>
+            </w:pPr>
+            <w:r>
+              <w:rPr>
+                <w:rFonts w:ascii="Arial" w:hAnsi="Arial"/>
+                <w:b w:val="0"/>
+                <w:i w:val="0"/>
+                <w:color w:val="17212B"/>
+                <w:sz w:val="14"/>
+              </w:rPr>
+              <w:t>Cycle 4</w:t>
+            </w:r>
+          </w:p>
+        </w:tc>
+        <w:tc>
+          <w:tcPr>
+            <w:tcW w:type="dxa" w:w="1850"/>
+            <w:shd w:fill="FAFBFC"/>
+            <w:vAlign w:val="center"/>
+            <w:tcMar>
+              <w:top w:w="100" w:type="dxa"/>
+              <w:start w:w="120" w:type="dxa"/>
+              <w:bottom w:w="100" w:type="dxa"/>
+              <w:end w:w="120" w:type="dxa"/>
+            </w:tcMar>
+          </w:tcPr>
+          <w:p>
+            <w:pPr>
+              <w:spacing w:before="0" w:after="0" w:line="264" w:lineRule="auto"/>
+              <w:jc w:val="center"/>
+            </w:pPr>
+            <w:r>
+              <w:rPr>
+                <w:rFonts w:ascii="Arial" w:hAnsi="Arial"/>
+                <w:b w:val="0"/>
+                <w:i w:val="0"/>
+                <w:color w:val="17212B"/>
+                <w:sz w:val="14"/>
+              </w:rPr>
+              <w:t>$36,160</w:t>
+            </w:r>
+          </w:p>
+        </w:tc>
+        <w:tc>
+          <w:tcPr>
+            <w:tcW w:type="dxa" w:w="1750"/>
+            <w:shd w:fill="FAFBFC"/>
+            <w:vAlign w:val="center"/>
+            <w:tcMar>
+              <w:top w:w="100" w:type="dxa"/>
+              <w:start w:w="120" w:type="dxa"/>
+              <w:bottom w:w="100" w:type="dxa"/>
+              <w:end w:w="120" w:type="dxa"/>
+            </w:tcMar>
+          </w:tcPr>
+          <w:p>
+            <w:pPr>
+              <w:spacing w:before="0" w:after="0" w:line="264" w:lineRule="auto"/>
+              <w:jc w:val="center"/>
+            </w:pPr>
+            <w:r>
+              <w:rPr>
+                <w:rFonts w:ascii="Arial" w:hAnsi="Arial"/>
+                <w:b w:val="0"/>
+                <w:i w:val="0"/>
+                <w:color w:val="17212B"/>
+                <w:sz w:val="14"/>
+              </w:rPr>
+              <w:t>$6,996</w:t>
+            </w:r>
+          </w:p>
+        </w:tc>
+        <w:tc>
+          <w:tcPr>
+            <w:tcW w:type="dxa" w:w="1750"/>
+            <w:shd w:fill="FAFBFC"/>
+            <w:vAlign w:val="center"/>
+            <w:tcMar>
+              <w:top w:w="100" w:type="dxa"/>
+              <w:start w:w="120" w:type="dxa"/>
+              <w:bottom w:w="100" w:type="dxa"/>
+              <w:end w:w="120" w:type="dxa"/>
+            </w:tcMar>
+          </w:tcPr>
+          <w:p>
+            <w:pPr>
+              <w:spacing w:before="0" w:after="0" w:line="264" w:lineRule="auto"/>
+              <w:jc w:val="center"/>
+            </w:pPr>
+            <w:r>
+              <w:rPr>
+                <w:rFonts w:ascii="Arial" w:hAnsi="Arial"/>
+                <w:b w:val="0"/>
+                <w:i w:val="0"/>
+                <w:color w:val="17212B"/>
+                <w:sz w:val="14"/>
+              </w:rPr>
+              <w:t>$15,476</w:t>
+            </w:r>
+          </w:p>
+        </w:tc>
+        <w:tc>
+          <w:tcPr>
+            <w:tcW w:type="dxa" w:w="1700"/>
+            <w:shd w:fill="FAFBFC"/>
+            <w:vAlign w:val="center"/>
+            <w:tcMar>
+              <w:top w:w="100" w:type="dxa"/>
+              <w:start w:w="120" w:type="dxa"/>
+              <w:bottom w:w="100" w:type="dxa"/>
+              <w:end w:w="120" w:type="dxa"/>
+            </w:tcMar>
+          </w:tcPr>
+          <w:p>
+            <w:pPr>
+              <w:spacing w:before="0" w:after="0" w:line="264" w:lineRule="auto"/>
+              <w:jc w:val="center"/>
+            </w:pPr>
+            <w:r>
+              <w:rPr>
+                <w:rFonts w:ascii="Arial" w:hAnsi="Arial"/>
+                <w:b w:val="0"/>
+                <w:i w:val="0"/>
+                <w:color w:val="17212B"/>
+                <w:sz w:val="14"/>
+              </w:rPr>
+              <w:t>$13,840</w:t>
+            </w:r>
+          </w:p>
+        </w:tc>
+        <w:tc>
+          <w:tcPr>
+            <w:tcW w:type="dxa" w:w="2356"/>
+            <w:shd w:fill="FAFBFC"/>
+            <w:vAlign w:val="center"/>
+            <w:tcMar>
+              <w:top w:w="100" w:type="dxa"/>
+              <w:start w:w="120" w:type="dxa"/>
+              <w:bottom w:w="100" w:type="dxa"/>
+              <w:end w:w="120" w:type="dxa"/>
+            </w:tcMar>
+          </w:tcPr>
+          <w:p>
+            <w:pPr>
+              <w:spacing w:before="0" w:after="0" w:line="264" w:lineRule="auto"/>
+              <w:jc w:val="center"/>
+            </w:pPr>
+            <w:r>
+              <w:rPr>
+                <w:rFonts w:ascii="Arial" w:hAnsi="Arial"/>
+                <w:b w:val="0"/>
+                <w:i w:val="0"/>
+                <w:color w:val="17212B"/>
+                <w:sz w:val="14"/>
+              </w:rPr>
+              <w:t>$21,630</w:t>
+            </w:r>
+          </w:p>
+        </w:tc>
+      </w:tr>
+      <w:tr>
+        <w:tc>
+          <w:tcPr>
+            <w:tcW w:type="dxa" w:w="1250"/>
+            <w:vAlign w:val="center"/>
+            <w:tcMar>
+              <w:top w:w="100" w:type="dxa"/>
+              <w:start w:w="120" w:type="dxa"/>
+              <w:bottom w:w="100" w:type="dxa"/>
+              <w:end w:w="120" w:type="dxa"/>
+            </w:tcMar>
+          </w:tcPr>
+          <w:p>
+            <w:pPr>
+              <w:spacing w:before="0" w:after="0" w:line="264" w:lineRule="auto"/>
+              <w:jc w:val="left"/>
+            </w:pPr>
+            <w:r>
+              <w:rPr>
+                <w:rFonts w:ascii="Arial" w:hAnsi="Arial"/>
+                <w:b w:val="0"/>
+                <w:i w:val="0"/>
+                <w:color w:val="17212B"/>
+                <w:sz w:val="14"/>
+              </w:rPr>
+              <w:t>Cycle 5</w:t>
+            </w:r>
+          </w:p>
+        </w:tc>
+        <w:tc>
+          <w:tcPr>
+            <w:tcW w:type="dxa" w:w="1850"/>
+            <w:vAlign w:val="center"/>
+            <w:tcMar>
+              <w:top w:w="100" w:type="dxa"/>
+              <w:start w:w="120" w:type="dxa"/>
+              <w:bottom w:w="100" w:type="dxa"/>
+              <w:end w:w="120" w:type="dxa"/>
+            </w:tcMar>
+          </w:tcPr>
+          <w:p>
+            <w:pPr>
+              <w:spacing w:before="0" w:after="0" w:line="264" w:lineRule="auto"/>
+              <w:jc w:val="center"/>
+            </w:pPr>
+            <w:r>
+              <w:rPr>
+                <w:rFonts w:ascii="Arial" w:hAnsi="Arial"/>
+                <w:b w:val="0"/>
+                <w:i w:val="0"/>
+                <w:color w:val="17212B"/>
+                <w:sz w:val="14"/>
+              </w:rPr>
+              <w:t>$44,640</w:t>
+            </w:r>
+          </w:p>
+        </w:tc>
+        <w:tc>
+          <w:tcPr>
+            <w:tcW w:type="dxa" w:w="1750"/>
+            <w:vAlign w:val="center"/>
+            <w:tcMar>
+              <w:top w:w="100" w:type="dxa"/>
+              <w:start w:w="120" w:type="dxa"/>
+              <w:bottom w:w="100" w:type="dxa"/>
+              <w:end w:w="120" w:type="dxa"/>
+            </w:tcMar>
+          </w:tcPr>
+          <w:p>
+            <w:pPr>
+              <w:spacing w:before="0" w:after="0" w:line="264" w:lineRule="auto"/>
+              <w:jc w:val="center"/>
+            </w:pPr>
+            <w:r>
+              <w:rPr>
+                <w:rFonts w:ascii="Arial" w:hAnsi="Arial"/>
+                <w:b w:val="0"/>
+                <w:i w:val="0"/>
+                <w:color w:val="17212B"/>
+                <w:sz w:val="14"/>
+              </w:rPr>
+              <w:t>$6,996</w:t>
+            </w:r>
+          </w:p>
+        </w:tc>
+        <w:tc>
+          <w:tcPr>
+            <w:tcW w:type="dxa" w:w="1750"/>
+            <w:vAlign w:val="center"/>
+            <w:tcMar>
+              <w:top w:w="100" w:type="dxa"/>
+              <w:start w:w="120" w:type="dxa"/>
+              <w:bottom w:w="100" w:type="dxa"/>
+              <w:end w:w="120" w:type="dxa"/>
+            </w:tcMar>
+          </w:tcPr>
+          <w:p>
+            <w:pPr>
+              <w:spacing w:before="0" w:after="0" w:line="264" w:lineRule="auto"/>
+              <w:jc w:val="center"/>
+            </w:pPr>
+            <w:r>
+              <w:rPr>
+                <w:rFonts w:ascii="Arial" w:hAnsi="Arial"/>
+                <w:b w:val="0"/>
+                <w:i w:val="0"/>
+                <w:color w:val="17212B"/>
+                <w:sz w:val="14"/>
+              </w:rPr>
+              <w:t>$10,836</w:t>
+            </w:r>
+          </w:p>
+        </w:tc>
+        <w:tc>
+          <w:tcPr>
+            <w:tcW w:type="dxa" w:w="1700"/>
+            <w:vAlign w:val="center"/>
+            <w:tcMar>
+              <w:top w:w="100" w:type="dxa"/>
+              <w:start w:w="120" w:type="dxa"/>
+              <w:bottom w:w="100" w:type="dxa"/>
+              <w:end w:w="120" w:type="dxa"/>
+            </w:tcMar>
+          </w:tcPr>
+          <w:p>
+            <w:pPr>
+              <w:spacing w:before="0" w:after="0" w:line="264" w:lineRule="auto"/>
+              <w:jc w:val="center"/>
+            </w:pPr>
+            <w:r>
+              <w:rPr>
+                <w:rFonts w:ascii="Arial" w:hAnsi="Arial"/>
+                <w:b w:val="0"/>
+                <w:i w:val="0"/>
+                <w:color w:val="17212B"/>
+                <w:sz w:val="14"/>
+              </w:rPr>
+              <w:t>$10,000</w:t>
+            </w:r>
+          </w:p>
+        </w:tc>
+        <w:tc>
+          <w:tcPr>
+            <w:tcW w:type="dxa" w:w="2356"/>
+            <w:vAlign w:val="center"/>
+            <w:tcMar>
+              <w:top w:w="100" w:type="dxa"/>
+              <w:start w:w="120" w:type="dxa"/>
+              <w:bottom w:w="100" w:type="dxa"/>
+              <w:end w:w="120" w:type="dxa"/>
+            </w:tcMar>
+          </w:tcPr>
+          <w:p>
+            <w:pPr>
+              <w:spacing w:before="0" w:after="0" w:line="264" w:lineRule="auto"/>
+              <w:jc w:val="center"/>
+            </w:pPr>
+            <w:r>
+              <w:rPr>
+                <w:rFonts w:ascii="Arial" w:hAnsi="Arial"/>
+                <w:b w:val="0"/>
+                <w:i w:val="0"/>
+                <w:color w:val="17212B"/>
+                <w:sz w:val="14"/>
+              </w:rPr>
+              <w:t>$16,990</w:t>
+            </w:r>
+          </w:p>
+        </w:tc>
+      </w:tr>
+      <w:tr>
+        <w:tc>
+          <w:tcPr>
+            <w:tcW w:type="dxa" w:w="1250"/>
+            <w:shd w:fill="FAFBFC"/>
+            <w:vAlign w:val="center"/>
+            <w:tcMar>
+              <w:top w:w="100" w:type="dxa"/>
+              <w:start w:w="120" w:type="dxa"/>
+              <w:bottom w:w="100" w:type="dxa"/>
+              <w:end w:w="120" w:type="dxa"/>
+            </w:tcMar>
+          </w:tcPr>
+          <w:p>
+            <w:pPr>
+              <w:spacing w:before="0" w:after="0" w:line="264" w:lineRule="auto"/>
+              <w:jc w:val="left"/>
+            </w:pPr>
+            <w:r>
+              <w:rPr>
+                <w:rFonts w:ascii="Arial" w:hAnsi="Arial"/>
+                <w:b w:val="0"/>
+                <w:i w:val="0"/>
+                <w:color w:val="17212B"/>
+                <w:sz w:val="14"/>
+              </w:rPr>
+              <w:t>Cycle 6</w:t>
+            </w:r>
+          </w:p>
+        </w:tc>
+        <w:tc>
+          <w:tcPr>
+            <w:tcW w:type="dxa" w:w="1850"/>
+            <w:shd w:fill="FAFBFC"/>
+            <w:vAlign w:val="center"/>
+            <w:tcMar>
+              <w:top w:w="100" w:type="dxa"/>
+              <w:start w:w="120" w:type="dxa"/>
+              <w:bottom w:w="100" w:type="dxa"/>
+              <w:end w:w="120" w:type="dxa"/>
+            </w:tcMar>
+          </w:tcPr>
+          <w:p>
+            <w:pPr>
+              <w:spacing w:before="0" w:after="0" w:line="264" w:lineRule="auto"/>
+              <w:jc w:val="center"/>
+            </w:pPr>
+            <w:r>
+              <w:rPr>
+                <w:rFonts w:ascii="Arial" w:hAnsi="Arial"/>
+                <w:b w:val="0"/>
+                <w:i w:val="0"/>
+                <w:color w:val="17212B"/>
+                <w:sz w:val="14"/>
+              </w:rPr>
+              <w:t>$53,120</w:t>
+            </w:r>
+          </w:p>
+        </w:tc>
+        <w:tc>
+          <w:tcPr>
+            <w:tcW w:type="dxa" w:w="1750"/>
+            <w:shd w:fill="FAFBFC"/>
+            <w:vAlign w:val="center"/>
+            <w:tcMar>
+              <w:top w:w="100" w:type="dxa"/>
+              <w:start w:w="120" w:type="dxa"/>
+              <w:bottom w:w="100" w:type="dxa"/>
+              <w:end w:w="120" w:type="dxa"/>
+            </w:tcMar>
+          </w:tcPr>
+          <w:p>
+            <w:pPr>
+              <w:spacing w:before="0" w:after="0" w:line="264" w:lineRule="auto"/>
+              <w:jc w:val="center"/>
+            </w:pPr>
+            <w:r>
+              <w:rPr>
+                <w:rFonts w:ascii="Arial" w:hAnsi="Arial"/>
+                <w:b w:val="0"/>
+                <w:i w:val="0"/>
+                <w:color w:val="17212B"/>
+                <w:sz w:val="14"/>
+              </w:rPr>
+              <w:t>$6,996</w:t>
+            </w:r>
+          </w:p>
+        </w:tc>
+        <w:tc>
+          <w:tcPr>
+            <w:tcW w:type="dxa" w:w="1750"/>
+            <w:shd w:fill="FAFBFC"/>
+            <w:vAlign w:val="center"/>
+            <w:tcMar>
+              <w:top w:w="100" w:type="dxa"/>
+              <w:start w:w="120" w:type="dxa"/>
+              <w:bottom w:w="100" w:type="dxa"/>
+              <w:end w:w="120" w:type="dxa"/>
+            </w:tcMar>
+          </w:tcPr>
+          <w:p>
+            <w:pPr>
+              <w:spacing w:before="0" w:after="0" w:line="264" w:lineRule="auto"/>
+              <w:jc w:val="center"/>
+            </w:pPr>
+            <w:r>
+              <w:rPr>
+                <w:rFonts w:ascii="Arial" w:hAnsi="Arial"/>
+                <w:b w:val="0"/>
+                <w:i w:val="0"/>
+                <w:color w:val="17212B"/>
+                <w:sz w:val="14"/>
+              </w:rPr>
+              <w:t>$6,996</w:t>
+            </w:r>
+          </w:p>
+        </w:tc>
+        <w:tc>
+          <w:tcPr>
+            <w:tcW w:type="dxa" w:w="1700"/>
+            <w:shd w:fill="FAFBFC"/>
+            <w:vAlign w:val="center"/>
+            <w:tcMar>
+              <w:top w:w="100" w:type="dxa"/>
+              <w:start w:w="120" w:type="dxa"/>
+              <w:bottom w:w="100" w:type="dxa"/>
+              <w:end w:w="120" w:type="dxa"/>
+            </w:tcMar>
+          </w:tcPr>
+          <w:p>
+            <w:pPr>
+              <w:spacing w:before="0" w:after="0" w:line="264" w:lineRule="auto"/>
+              <w:jc w:val="center"/>
+            </w:pPr>
+            <w:r>
+              <w:rPr>
+                <w:rFonts w:ascii="Arial" w:hAnsi="Arial"/>
+                <w:b w:val="0"/>
+                <w:i w:val="0"/>
+                <w:color w:val="17212B"/>
+                <w:sz w:val="14"/>
+              </w:rPr>
+              <w:t>$10,000</w:t>
+            </w:r>
+          </w:p>
+        </w:tc>
+        <w:tc>
+          <w:tcPr>
+            <w:tcW w:type="dxa" w:w="2356"/>
+            <w:shd w:fill="FAFBFC"/>
+            <w:vAlign w:val="center"/>
+            <w:tcMar>
+              <w:top w:w="100" w:type="dxa"/>
+              <w:start w:w="120" w:type="dxa"/>
+              <w:bottom w:w="100" w:type="dxa"/>
+              <w:end w:w="120" w:type="dxa"/>
+            </w:tcMar>
+          </w:tcPr>
+          <w:p>
+            <w:pPr>
+              <w:spacing w:before="0" w:after="0" w:line="264" w:lineRule="auto"/>
+              <w:jc w:val="center"/>
+            </w:pPr>
+            <w:r>
+              <w:rPr>
+                <w:rFonts w:ascii="Arial" w:hAnsi="Arial"/>
+                <w:b w:val="0"/>
+                <w:i w:val="0"/>
+                <w:color w:val="17212B"/>
+                <w:sz w:val="14"/>
+              </w:rPr>
+              <w:t>$13,150</w:t>
+            </w:r>
+          </w:p>
+        </w:tc>
+      </w:tr>
+      <w:tr>
+        <w:tc>
+          <w:tcPr>
+            <w:tcW w:type="dxa" w:w="1250"/>
+            <w:vAlign w:val="center"/>
+            <w:tcMar>
+              <w:top w:w="100" w:type="dxa"/>
+              <w:start w:w="120" w:type="dxa"/>
+              <w:bottom w:w="100" w:type="dxa"/>
+              <w:end w:w="120" w:type="dxa"/>
+            </w:tcMar>
+          </w:tcPr>
+          <w:p>
+            <w:pPr>
+              <w:spacing w:before="0" w:after="0" w:line="264" w:lineRule="auto"/>
+              <w:jc w:val="left"/>
+            </w:pPr>
+            <w:r>
+              <w:rPr>
+                <w:rFonts w:ascii="Arial" w:hAnsi="Arial"/>
+                <w:b w:val="0"/>
+                <w:i w:val="0"/>
+                <w:color w:val="17212B"/>
+                <w:sz w:val="14"/>
+              </w:rPr>
+              <w:t>Cycle 7</w:t>
+            </w:r>
+          </w:p>
+        </w:tc>
+        <w:tc>
+          <w:tcPr>
+            <w:tcW w:type="dxa" w:w="1850"/>
+            <w:vAlign w:val="center"/>
+            <w:tcMar>
+              <w:top w:w="100" w:type="dxa"/>
+              <w:start w:w="120" w:type="dxa"/>
+              <w:bottom w:w="100" w:type="dxa"/>
+              <w:end w:w="120" w:type="dxa"/>
+            </w:tcMar>
+          </w:tcPr>
+          <w:p>
+            <w:pPr>
+              <w:spacing w:before="0" w:after="0" w:line="264" w:lineRule="auto"/>
+              <w:jc w:val="center"/>
+            </w:pPr>
+            <w:r>
+              <w:rPr>
+                <w:rFonts w:ascii="Arial" w:hAnsi="Arial"/>
+                <w:b w:val="0"/>
+                <w:i w:val="0"/>
+                <w:color w:val="17212B"/>
+                <w:sz w:val="14"/>
+              </w:rPr>
+              <w:t>$61,600</w:t>
+            </w:r>
+          </w:p>
+        </w:tc>
+        <w:tc>
+          <w:tcPr>
+            <w:tcW w:type="dxa" w:w="1750"/>
+            <w:vAlign w:val="center"/>
+            <w:tcMar>
+              <w:top w:w="100" w:type="dxa"/>
+              <w:start w:w="120" w:type="dxa"/>
+              <w:bottom w:w="100" w:type="dxa"/>
+              <w:end w:w="120" w:type="dxa"/>
+            </w:tcMar>
+          </w:tcPr>
+          <w:p>
+            <w:pPr>
+              <w:spacing w:before="0" w:after="0" w:line="264" w:lineRule="auto"/>
+              <w:jc w:val="center"/>
+            </w:pPr>
+            <w:r>
+              <w:rPr>
+                <w:rFonts w:ascii="Arial" w:hAnsi="Arial"/>
+                <w:b w:val="0"/>
+                <w:i w:val="0"/>
+                <w:color w:val="17212B"/>
+                <w:sz w:val="14"/>
+              </w:rPr>
+              <w:t>$6,996</w:t>
+            </w:r>
+          </w:p>
+        </w:tc>
+        <w:tc>
+          <w:tcPr>
+            <w:tcW w:type="dxa" w:w="1750"/>
+            <w:vAlign w:val="center"/>
+            <w:tcMar>
+              <w:top w:w="100" w:type="dxa"/>
+              <w:start w:w="120" w:type="dxa"/>
+              <w:bottom w:w="100" w:type="dxa"/>
+              <w:end w:w="120" w:type="dxa"/>
+            </w:tcMar>
+          </w:tcPr>
+          <w:p>
+            <w:pPr>
+              <w:spacing w:before="0" w:after="0" w:line="264" w:lineRule="auto"/>
+              <w:jc w:val="center"/>
+            </w:pPr>
+            <w:r>
+              <w:rPr>
+                <w:rFonts w:ascii="Arial" w:hAnsi="Arial"/>
+                <w:b w:val="0"/>
+                <w:i w:val="0"/>
+                <w:color w:val="17212B"/>
+                <w:sz w:val="14"/>
+              </w:rPr>
+              <w:t>$6,996</w:t>
+            </w:r>
+          </w:p>
+        </w:tc>
+        <w:tc>
+          <w:tcPr>
+            <w:tcW w:type="dxa" w:w="1700"/>
+            <w:vAlign w:val="center"/>
+            <w:tcMar>
+              <w:top w:w="100" w:type="dxa"/>
+              <w:start w:w="120" w:type="dxa"/>
+              <w:bottom w:w="100" w:type="dxa"/>
+              <w:end w:w="120" w:type="dxa"/>
+            </w:tcMar>
+          </w:tcPr>
+          <w:p>
+            <w:pPr>
+              <w:spacing w:before="0" w:after="0" w:line="264" w:lineRule="auto"/>
+              <w:jc w:val="center"/>
+            </w:pPr>
+            <w:r>
+              <w:rPr>
+                <w:rFonts w:ascii="Arial" w:hAnsi="Arial"/>
+                <w:b w:val="0"/>
+                <w:i w:val="0"/>
+                <w:color w:val="17212B"/>
+                <w:sz w:val="14"/>
+              </w:rPr>
+              <w:t>$10,000</w:t>
+            </w:r>
+          </w:p>
+        </w:tc>
+        <w:tc>
+          <w:tcPr>
+            <w:tcW w:type="dxa" w:w="2356"/>
+            <w:vAlign w:val="center"/>
+            <w:tcMar>
+              <w:top w:w="100" w:type="dxa"/>
+              <w:start w:w="120" w:type="dxa"/>
+              <w:bottom w:w="100" w:type="dxa"/>
+              <w:end w:w="120" w:type="dxa"/>
+            </w:tcMar>
+          </w:tcPr>
+          <w:p>
+            <w:pPr>
+              <w:spacing w:before="0" w:after="0" w:line="264" w:lineRule="auto"/>
+              <w:jc w:val="center"/>
+            </w:pPr>
+            <w:r>
+              <w:rPr>
+                <w:rFonts w:ascii="Arial" w:hAnsi="Arial"/>
+                <w:b w:val="0"/>
+                <w:i w:val="0"/>
+                <w:color w:val="17212B"/>
+                <w:sz w:val="14"/>
+              </w:rPr>
+              <w:t>$13,150</w:t>
+            </w:r>
+          </w:p>
+        </w:tc>
+      </w:tr>
+      <w:tr>
+        <w:tc>
+          <w:tcPr>
+            <w:tcW w:type="dxa" w:w="1250"/>
+            <w:shd w:fill="FAFBFC"/>
+            <w:vAlign w:val="center"/>
+            <w:tcMar>
+              <w:top w:w="100" w:type="dxa"/>
+              <w:start w:w="120" w:type="dxa"/>
+              <w:bottom w:w="100" w:type="dxa"/>
+              <w:end w:w="120" w:type="dxa"/>
+            </w:tcMar>
+          </w:tcPr>
+          <w:p>
+            <w:pPr>
+              <w:spacing w:before="0" w:after="0" w:line="264" w:lineRule="auto"/>
+              <w:jc w:val="left"/>
+            </w:pPr>
+            <w:r>
+              <w:rPr>
+                <w:rFonts w:ascii="Arial" w:hAnsi="Arial"/>
+                <w:b w:val="0"/>
+                <w:i w:val="0"/>
+                <w:color w:val="17212B"/>
+                <w:sz w:val="14"/>
+              </w:rPr>
+              <w:t>Completion</w:t>
+            </w:r>
+          </w:p>
+        </w:tc>
+        <w:tc>
+          <w:tcPr>
+            <w:tcW w:type="dxa" w:w="1850"/>
+            <w:shd w:fill="FAFBFC"/>
+            <w:vAlign w:val="center"/>
+            <w:tcMar>
+              <w:top w:w="100" w:type="dxa"/>
+              <w:start w:w="120" w:type="dxa"/>
+              <w:bottom w:w="100" w:type="dxa"/>
+              <w:end w:w="120" w:type="dxa"/>
+            </w:tcMar>
+          </w:tcPr>
+          <w:p>
+            <w:pPr>
+              <w:spacing w:before="0" w:after="0" w:line="264" w:lineRule="auto"/>
+              <w:jc w:val="center"/>
+            </w:pPr>
+            <w:r>
+              <w:rPr>
+                <w:rFonts w:ascii="Arial" w:hAnsi="Arial"/>
+                <w:b w:val="0"/>
+                <w:i w:val="0"/>
+                <w:color w:val="17212B"/>
+                <w:sz w:val="14"/>
+              </w:rPr>
+              <w:t>$82,000</w:t>
+            </w:r>
+          </w:p>
+        </w:tc>
+        <w:tc>
+          <w:tcPr>
+            <w:tcW w:type="dxa" w:w="1750"/>
+            <w:shd w:fill="FAFBFC"/>
+            <w:vAlign w:val="center"/>
+            <w:tcMar>
+              <w:top w:w="100" w:type="dxa"/>
+              <w:start w:w="120" w:type="dxa"/>
+              <w:bottom w:w="100" w:type="dxa"/>
+              <w:end w:w="120" w:type="dxa"/>
+            </w:tcMar>
+          </w:tcPr>
+          <w:p>
+            <w:pPr>
+              <w:spacing w:before="0" w:after="0" w:line="264" w:lineRule="auto"/>
+              <w:jc w:val="center"/>
+            </w:pPr>
+            <w:r>
+              <w:rPr>
+                <w:rFonts w:ascii="Arial" w:hAnsi="Arial"/>
+                <w:b w:val="0"/>
+                <w:i w:val="0"/>
+                <w:color w:val="17212B"/>
+                <w:sz w:val="14"/>
+              </w:rPr>
+              <w:t>$0</w:t>
+            </w:r>
+          </w:p>
+        </w:tc>
+        <w:tc>
+          <w:tcPr>
+            <w:tcW w:type="dxa" w:w="1750"/>
+            <w:shd w:fill="FAFBFC"/>
+            <w:vAlign w:val="center"/>
+            <w:tcMar>
+              <w:top w:w="100" w:type="dxa"/>
+              <w:start w:w="120" w:type="dxa"/>
+              <w:bottom w:w="100" w:type="dxa"/>
+              <w:end w:w="120" w:type="dxa"/>
+            </w:tcMar>
+          </w:tcPr>
+          <w:p>
+            <w:pPr>
+              <w:spacing w:before="0" w:after="0" w:line="264" w:lineRule="auto"/>
+              <w:jc w:val="center"/>
+            </w:pPr>
+            <w:r>
+              <w:rPr>
+                <w:rFonts w:ascii="Arial" w:hAnsi="Arial"/>
+                <w:b w:val="0"/>
+                <w:i w:val="0"/>
+                <w:color w:val="17212B"/>
+                <w:sz w:val="14"/>
+              </w:rPr>
+              <w:t>$10,000</w:t>
+            </w:r>
+          </w:p>
+        </w:tc>
+        <w:tc>
+          <w:tcPr>
+            <w:tcW w:type="dxa" w:w="1700"/>
+            <w:shd w:fill="FAFBFC"/>
+            <w:vAlign w:val="center"/>
+            <w:tcMar>
+              <w:top w:w="100" w:type="dxa"/>
+              <w:start w:w="120" w:type="dxa"/>
+              <w:bottom w:w="100" w:type="dxa"/>
+              <w:end w:w="120" w:type="dxa"/>
+            </w:tcMar>
+          </w:tcPr>
+          <w:p>
+            <w:pPr>
+              <w:spacing w:before="0" w:after="0" w:line="264" w:lineRule="auto"/>
+              <w:jc w:val="center"/>
+            </w:pPr>
+            <w:r>
+              <w:rPr>
+                <w:rFonts w:ascii="Arial" w:hAnsi="Arial"/>
+                <w:b w:val="0"/>
+                <w:i w:val="0"/>
+                <w:color w:val="17212B"/>
+                <w:sz w:val="14"/>
+              </w:rPr>
+              <w:t>$0</w:t>
+            </w:r>
+          </w:p>
+        </w:tc>
+        <w:tc>
+          <w:tcPr>
+            <w:tcW w:type="dxa" w:w="2356"/>
+            <w:shd w:fill="FAFBFC"/>
+            <w:vAlign w:val="center"/>
+            <w:tcMar>
+              <w:top w:w="100" w:type="dxa"/>
+              <w:start w:w="120" w:type="dxa"/>
+              <w:bottom w:w="100" w:type="dxa"/>
+              <w:end w:w="120" w:type="dxa"/>
+            </w:tcMar>
+          </w:tcPr>
+          <w:p>
+            <w:pPr>
+              <w:spacing w:before="0" w:after="0" w:line="264" w:lineRule="auto"/>
+              <w:jc w:val="center"/>
+            </w:pPr>
+            <w:r>
+              <w:rPr>
+                <w:rFonts w:ascii="Arial" w:hAnsi="Arial"/>
+                <w:b w:val="0"/>
+                <w:i w:val="0"/>
+                <w:color w:val="17212B"/>
+                <w:sz w:val="14"/>
+              </w:rPr>
+              <w:t>$10,000</w:t>
+            </w:r>
+          </w:p>
+        </w:tc>
+      </w:tr>
+      <w:tr>
+        <w:tc>
+          <w:tcPr>
+            <w:tcW w:type="dxa" w:w="1250"/>
+            <w:shd w:fill="E5F3F0"/>
+            <w:vAlign w:val="center"/>
+            <w:tcMar>
+              <w:top w:w="100" w:type="dxa"/>
+              <w:start w:w="120" w:type="dxa"/>
+              <w:bottom w:w="100" w:type="dxa"/>
+              <w:end w:w="120" w:type="dxa"/>
+            </w:tcMar>
+          </w:tcPr>
+          <w:p>
+            <w:pPr>
+              <w:spacing w:before="0" w:after="0" w:line="264" w:lineRule="auto"/>
+              <w:jc w:val="left"/>
+            </w:pPr>
+            <w:r>
+              <w:rPr>
+                <w:rFonts w:ascii="Arial" w:hAnsi="Arial"/>
+                <w:b/>
+                <w:i w:val="0"/>
+                <w:color w:val="17212B"/>
+                <w:sz w:val="14"/>
+              </w:rPr>
+              <w:t>Total</w:t>
+            </w:r>
+          </w:p>
+        </w:tc>
+        <w:tc>
+          <w:tcPr>
+            <w:tcW w:type="dxa" w:w="1850"/>
+            <w:shd w:fill="E5F3F0"/>
+            <w:vAlign w:val="center"/>
+            <w:tcMar>
+              <w:top w:w="100" w:type="dxa"/>
+              <w:start w:w="120" w:type="dxa"/>
+              <w:bottom w:w="100" w:type="dxa"/>
+              <w:end w:w="120" w:type="dxa"/>
+            </w:tcMar>
+          </w:tcPr>
+          <w:p>
+            <w:pPr>
+              <w:spacing w:before="0" w:after="0" w:line="264" w:lineRule="auto"/>
+              <w:jc w:val="center"/>
+            </w:pPr>
+            <w:r>
+              <w:rPr>
+                <w:rFonts w:ascii="Arial" w:hAnsi="Arial"/>
+                <w:b/>
+                <w:i w:val="0"/>
+                <w:color w:val="17212B"/>
+                <w:sz w:val="14"/>
+              </w:rPr>
+              <w:t>$82,000</w:t>
+            </w:r>
+          </w:p>
+        </w:tc>
+        <w:tc>
+          <w:tcPr>
+            <w:tcW w:type="dxa" w:w="1750"/>
+            <w:shd w:fill="E5F3F0"/>
+            <w:vAlign w:val="center"/>
+            <w:tcMar>
+              <w:top w:w="100" w:type="dxa"/>
+              <w:start w:w="120" w:type="dxa"/>
+              <w:bottom w:w="100" w:type="dxa"/>
+              <w:end w:w="120" w:type="dxa"/>
+            </w:tcMar>
+          </w:tcPr>
+          <w:p>
+            <w:pPr>
+              <w:spacing w:before="0" w:after="0" w:line="264" w:lineRule="auto"/>
+              <w:jc w:val="center"/>
+            </w:pPr>
+            <w:r>
+              <w:rPr>
+                <w:rFonts w:ascii="Arial" w:hAnsi="Arial"/>
+                <w:b/>
+                <w:i w:val="0"/>
+                <w:color w:val="17212B"/>
+                <w:sz w:val="14"/>
+              </w:rPr>
+              <w:t>$50,820</w:t>
+            </w:r>
+          </w:p>
+        </w:tc>
+        <w:tc>
+          <w:tcPr>
+            <w:tcW w:type="dxa" w:w="1750"/>
+            <w:shd w:fill="E5F3F0"/>
+            <w:vAlign w:val="center"/>
+            <w:tcMar>
+              <w:top w:w="100" w:type="dxa"/>
+              <w:start w:w="120" w:type="dxa"/>
+              <w:bottom w:w="100" w:type="dxa"/>
+              <w:end w:w="120" w:type="dxa"/>
+            </w:tcMar>
+          </w:tcPr>
+          <w:p>
+            <w:pPr>
+              <w:spacing w:before="0" w:after="0" w:line="264" w:lineRule="auto"/>
+              <w:jc w:val="center"/>
+            </w:pPr>
+            <w:r>
+              <w:rPr>
+                <w:rFonts w:ascii="Arial" w:hAnsi="Arial"/>
+                <w:b/>
+                <w:i w:val="0"/>
+                <w:color w:val="17212B"/>
+                <w:sz w:val="14"/>
+              </w:rPr>
+              <w:t>$50,820</w:t>
+            </w:r>
+          </w:p>
+        </w:tc>
+        <w:tc>
+          <w:tcPr>
+            <w:tcW w:type="dxa" w:w="1700"/>
+            <w:shd w:fill="E5F3F0"/>
+            <w:vAlign w:val="center"/>
+            <w:tcMar>
+              <w:top w:w="100" w:type="dxa"/>
+              <w:start w:w="120" w:type="dxa"/>
+              <w:bottom w:w="100" w:type="dxa"/>
+              <w:end w:w="120" w:type="dxa"/>
+            </w:tcMar>
+          </w:tcPr>
+          <w:p>
+            <w:pPr>
+              <w:spacing w:before="0" w:after="0" w:line="264" w:lineRule="auto"/>
+              <w:jc w:val="center"/>
+            </w:pPr>
+            <w:r>
+              <w:rPr>
+                <w:rFonts w:ascii="Arial" w:hAnsi="Arial"/>
+                <w:b/>
+                <w:i w:val="0"/>
+                <w:color w:val="17212B"/>
+                <w:sz w:val="14"/>
+              </w:rPr>
+              <w:t>$0</w:t>
+            </w:r>
+          </w:p>
+        </w:tc>
+        <w:tc>
+          <w:tcPr>
+            <w:tcW w:type="dxa" w:w="2356"/>
+            <w:shd w:fill="E5F3F0"/>
+            <w:vAlign w:val="center"/>
+            <w:tcMar>
+              <w:top w:w="100" w:type="dxa"/>
+              <w:start w:w="120" w:type="dxa"/>
+              <w:bottom w:w="100" w:type="dxa"/>
+              <w:end w:w="120" w:type="dxa"/>
+            </w:tcMar>
+          </w:tcPr>
+          <w:p>
+            <w:pPr>
+              <w:spacing w:before="0" w:after="0" w:line="264" w:lineRule="auto"/>
+              <w:jc w:val="center"/>
+            </w:pPr>
+            <w:r>
+              <w:rPr>
+                <w:rFonts w:ascii="Arial" w:hAnsi="Arial"/>
+                <w:b/>
+                <w:i w:val="0"/>
+                <w:color w:val="17212B"/>
+                <w:sz w:val="14"/>
+              </w:rPr>
+              <w:t>$96,250</w:t>
+            </w:r>
+          </w:p>
+        </w:tc>
+      </w:tr>
+    </w:tbl>
+    <w:p>
+      <w:pPr>
+        <w:spacing w:after="40"/>
+      </w:pPr>
+    </w:p>
+    <w:p>
+      <w:pPr>
+        <w:spacing w:before="120" w:after="80" w:line="300" w:lineRule="auto"/>
+      </w:pPr>
+      <w:r>
+        <w:rPr>
+          <w:rFonts w:ascii="Arial" w:hAnsi="Arial"/>
+          <w:b w:val="0"/>
+          <w:i/>
+          <w:color w:val="667085"/>
+          <w:sz w:val="16"/>
+        </w:rPr>
+        <w:t>No-loss projection only. A Confirmed Loss, overdue mandatory report, default, or open dispute may reduce or suspend release. The reserve is not insurance or a guarantee, and this model does not determine legal ownership while funds are locked.</w:t>
+      </w:r>
+    </w:p>
+    <w:p>
+      <w:pPr>
+        <w:pageBreakBefore/>
+        <w:spacing w:before="0" w:after="0" w:line="24" w:lineRule="auto"/>
+      </w:pPr>
+      <w:r>
+        <w:rPr>
+          <w:rFonts w:ascii="Arial" w:hAnsi="Arial"/>
+          <w:b w:val="0"/>
+          <w:i w:val="0"/>
+          <w:color w:val="FFFFFF"/>
+          <w:sz w:val="2"/>
+        </w:rPr>
+      </w:r>
+    </w:p>
+    <w:tbl>
+      <w:tblPr>
+        <w:tblW w:type="dxa" w:w="10656"/>
+        <w:tblLayout w:type="fixed"/>
+        <w:tblLook w:firstColumn="1" w:firstRow="1" w:lastColumn="0" w:lastRow="0" w:noHBand="0" w:noVBand="1" w:val="04A0"/>
+        <w:tblInd w:w="120" w:type="dxa"/>
+      </w:tblPr>
+      <w:tblGrid>
+        <w:gridCol w:w="10656"/>
+      </w:tblGrid>
+      <w:tr>
+        <w:tc>
+          <w:tcPr>
+            <w:tcW w:type="dxa" w:w="10656"/>
+            <w:shd w:fill="1769C2"/>
+            <w:tcMar>
+              <w:top w:w="100" w:type="dxa"/>
+              <w:start w:w="120" w:type="dxa"/>
+              <w:bottom w:w="100" w:type="dxa"/>
+              <w:end w:w="120" w:type="dxa"/>
+            </w:tcMar>
+          </w:tcPr>
+          <w:p>
+            <w:pPr>
+              <w:spacing w:before="0" w:after="0" w:line="240" w:lineRule="auto"/>
+            </w:pPr>
+            <w:r>
+              <w:rPr>
+                <w:rFonts w:ascii="Arial" w:hAnsi="Arial"/>
+                <w:b/>
+                <w:i w:val="0"/>
+                <w:color w:val="FFFFFF"/>
+                <w:sz w:val="22"/>
+              </w:rPr>
               <w:t>Final financial outcome</w:t>
             </w:r>
           </w:p>
@@ -9352,7 +10244,7 @@
                 <w:color w:val="004D40"/>
                 <w:sz w:val="34"/>
               </w:rPr>
-              <w:t>$15,250</w:t>
+              <w:t>$7,330</w:t>
             </w:r>
           </w:p>
         </w:tc>
@@ -9724,6 +10616,181 @@
                 <w:sz w:val="16"/>
               </w:rPr>
               <w:t>Farmer operating costs</w:t>
+            </w:r>
+          </w:p>
+        </w:tc>
+      </w:tr>
+      <w:tr>
+        <w:tc>
+          <w:tcPr>
+            <w:tcW w:type="dxa" w:w="4000"/>
+            <w:vAlign w:val="center"/>
+            <w:tcMar>
+              <w:top w:w="100" w:type="dxa"/>
+              <w:start w:w="120" w:type="dxa"/>
+              <w:bottom w:w="100" w:type="dxa"/>
+              <w:end w:w="120" w:type="dxa"/>
+            </w:tcMar>
+          </w:tcPr>
+          <w:p>
+            <w:pPr>
+              <w:spacing w:before="0" w:after="0" w:line="264" w:lineRule="auto"/>
+              <w:jc w:val="left"/>
+            </w:pPr>
+            <w:r>
+              <w:rPr>
+                <w:rFonts w:ascii="Arial" w:hAnsi="Arial"/>
+                <w:b w:val="0"/>
+                <w:i w:val="0"/>
+                <w:color w:val="17212B"/>
+                <w:sz w:val="16"/>
+              </w:rPr>
+              <w:t>Reserve contribution (44%)</w:t>
+            </w:r>
+          </w:p>
+        </w:tc>
+        <w:tc>
+          <w:tcPr>
+            <w:tcW w:type="dxa" w:w="2300"/>
+            <w:vAlign w:val="center"/>
+            <w:tcMar>
+              <w:top w:w="100" w:type="dxa"/>
+              <w:start w:w="120" w:type="dxa"/>
+              <w:bottom w:w="100" w:type="dxa"/>
+              <w:end w:w="120" w:type="dxa"/>
+            </w:tcMar>
+          </w:tcPr>
+          <w:p>
+            <w:pPr>
+              <w:spacing w:before="0" w:after="0" w:line="264" w:lineRule="auto"/>
+              <w:jc w:val="center"/>
+            </w:pPr>
+            <w:r>
+              <w:rPr>
+                <w:rFonts w:ascii="Arial" w:hAnsi="Arial"/>
+                <w:b w:val="0"/>
+                <w:i w:val="0"/>
+                <w:color w:val="17212B"/>
+                <w:sz w:val="16"/>
+              </w:rPr>
+              <w:t>-$50,820</w:t>
+            </w:r>
+          </w:p>
+        </w:tc>
+        <w:tc>
+          <w:tcPr>
+            <w:tcW w:type="dxa" w:w="4356"/>
+            <w:vAlign w:val="center"/>
+            <w:tcMar>
+              <w:top w:w="100" w:type="dxa"/>
+              <w:start w:w="120" w:type="dxa"/>
+              <w:bottom w:w="100" w:type="dxa"/>
+              <w:end w:w="120" w:type="dxa"/>
+            </w:tcMar>
+          </w:tcPr>
+          <w:p>
+            <w:pPr>
+              <w:spacing w:before="0" w:after="0" w:line="264" w:lineRule="auto"/>
+              <w:jc w:val="center"/>
+            </w:pPr>
+            <w:r>
+              <w:rPr>
+                <w:rFonts w:ascii="Arial" w:hAnsi="Arial"/>
+                <w:b w:val="0"/>
+                <w:i w:val="0"/>
+                <w:color w:val="17212B"/>
+                <w:sz w:val="16"/>
+              </w:rPr>
+              <w:t>Temporarily allocated from farmer share</w:t>
+            </w:r>
+          </w:p>
+        </w:tc>
+      </w:tr>
+      <w:tr>
+        <w:tc>
+          <w:tcPr>
+            <w:tcW w:type="dxa" w:w="4000"/>
+            <w:shd w:fill="FAFBFC"/>
+            <w:vAlign w:val="center"/>
+            <w:tcMar>
+              <w:top w:w="100" w:type="dxa"/>
+              <w:start w:w="120" w:type="dxa"/>
+              <w:bottom w:w="100" w:type="dxa"/>
+              <w:end w:w="120" w:type="dxa"/>
+            </w:tcMar>
+          </w:tcPr>
+          <w:p>
+            <w:pPr>
+              <w:spacing w:before="0" w:after="0" w:line="264" w:lineRule="auto"/>
+              <w:jc w:val="left"/>
+            </w:pPr>
+            <w:r>
+              <w:rPr>
+                <w:rFonts w:ascii="Arial" w:hAnsi="Arial"/>
+                <w:b w:val="0"/>
+                <w:i w:val="0"/>
+                <w:color w:val="17212B"/>
+                <w:sz w:val="16"/>
+              </w:rPr>
+              <w:t>Released to farmer</w:t>
+            </w:r>
+          </w:p>
+        </w:tc>
+        <w:tc>
+          <w:tcPr>
+            <w:tcW w:type="dxa" w:w="2300"/>
+            <w:shd w:fill="FAFBFC"/>
+            <w:vAlign w:val="center"/>
+            <w:tcMar>
+              <w:top w:w="100" w:type="dxa"/>
+              <w:start w:w="120" w:type="dxa"/>
+              <w:bottom w:w="100" w:type="dxa"/>
+              <w:end w:w="120" w:type="dxa"/>
+            </w:tcMar>
+          </w:tcPr>
+          <w:p>
+            <w:pPr>
+              <w:spacing w:before="0" w:after="0" w:line="264" w:lineRule="auto"/>
+              <w:jc w:val="center"/>
+            </w:pPr>
+            <w:r>
+              <w:rPr>
+                <w:rFonts w:ascii="Arial" w:hAnsi="Arial"/>
+                <w:b w:val="0"/>
+                <w:i w:val="0"/>
+                <w:color w:val="17212B"/>
+                <w:sz w:val="16"/>
+              </w:rPr>
+              <w:t>$50,820</w:t>
+            </w:r>
+          </w:p>
+        </w:tc>
+        <w:tc>
+          <w:tcPr>
+            <w:tcW w:type="dxa" w:w="4356"/>
+            <w:shd w:fill="FAFBFC"/>
+            <w:vAlign w:val="center"/>
+            <w:tcMar>
+              <w:top w:w="100" w:type="dxa"/>
+              <w:start w:w="120" w:type="dxa"/>
+              <w:bottom w:w="100" w:type="dxa"/>
+              <w:end w:w="120" w:type="dxa"/>
+            </w:tcMar>
+          </w:tcPr>
+          <w:p>
+            <w:pPr>
+              <w:spacing w:before="0" w:after="0" w:line="264" w:lineRule="auto"/>
+              <w:jc w:val="center"/>
+            </w:pPr>
+            <w:r>
+              <w:rPr>
+                <w:rFonts w:ascii="Arial" w:hAnsi="Arial"/>
+                <w:b w:val="0"/>
+                <w:i w:val="0"/>
+                <w:color w:val="17212B"/>
+                <w:sz w:val="16"/>
+              </w:rPr>
+              <w:t>No-loss modeled release</w:t>
             </w:r>
           </w:p>
         </w:tc>
@@ -10048,7 +11115,7 @@
           <w:color w:val="17212B"/>
           <w:sz w:val="21"/>
         </w:rPr>
-        <w:t>Figures are rounded to the nearest dollar; actual results may differ.</w:t>
+        <w:t>The 44% reserve is formed from the farmer share; the unused balance is intended to be returned to the farmer under established rules.</w:t>
       </w:r>
     </w:p>
     <w:p>
@@ -10064,7 +11131,23 @@
           <w:color w:val="17212B"/>
           <w:sz w:val="21"/>
         </w:rPr>
-        <w:t>Model duration: 35 months.</w:t>
+        <w:t>Staged release is modeled for a no-Confirmed-Loss scenario and may be suspended by reporting failure, default, or dispute.</w:t>
+      </w:r>
+    </w:p>
+    <w:p>
+      <w:pPr>
+        <w:pStyle w:val="ListBullet"/>
+        <w:spacing w:before="0" w:after="80" w:line="288" w:lineRule="auto"/>
+      </w:pPr>
+      <w:r>
+        <w:rPr>
+          <w:rFonts w:ascii="Arial" w:hAnsi="Arial"/>
+          <w:b w:val="0"/>
+          <w:i w:val="0"/>
+          <w:color w:val="17212B"/>
+          <w:sz w:val="21"/>
+        </w:rPr>
+        <w:t>Simple annualized ROI divides total ROI by the model duration in years; it does not account for compounding or the timing of interim payments.</w:t>
       </w:r>
     </w:p>
     <w:p>

</xml_diff>